<commit_message>
Publish clarified LTI mechanics
</commit_message>
<xml_diff>
--- a/lti/downloads/Aivel_LTI_programme_description.docx
+++ b/lti/downloads/Aivel_LTI_programme_description.docx
@@ -7,7 +7,10 @@
         <w:pStyle w:val="Title"/>
       </w:pPr>
       <w:r>
-        <w:t>Концепция долгосрочной программы</w:t>
+        <w:rPr>
+          <w:i w:val="0"/>
+        </w:rPr>
+        <w:t>Долгосрочная программа</w:t>
         <w:br/>
         <w:t>участия команды в стоимости компании</w:t>
       </w:r>
@@ -17,7 +20,10 @@
         <w:pStyle w:val="Subtitle"/>
       </w:pPr>
       <w:r>
-        <w:t>Синхронизированная версия: 9% плановых выдач + 1% резерв Совета директоров</w:t>
+        <w:rPr>
+          <w:i w:val="0"/>
+        </w:rPr>
+        <w:t>Публичное информационное описание: 9% плановых пакетов + 1% резерв СД</w:t>
       </w:r>
     </w:p>
     <w:tbl>
@@ -31,6 +37,9 @@
         <w:gridCol w:w="9866"/>
       </w:tblGrid>
       <w:tr>
+        <w:trPr>
+          <w:cantSplit/>
+        </w:trPr>
         <w:tc>
           <w:tcPr>
             <w:tcW w:type="dxa" w:w="9866"/>
@@ -45,15 +54,9 @@
           </w:tcPr>
           <w:p>
             <w:r>
-              <w:rPr>
-                <w:b/>
-                <w:color w:val="17365D"/>
-              </w:rPr>
               <w:t>Главная логика</w:t>
-            </w:r>
-            <w:r>
               <w:br/>
-              <w:t>Сотрудник заранее знает число единиц, за которое работает в текущем году. Совет директоров подтверждает результат после года и заново решает вопрос о следующем пакете. Плановые выдачи ограничены 9 млн исходных единиц, ещё 1 млн остаётся отдельным резервом Совета директоров.</w:t>
+              <w:t>Программа связывает вознаграждение ключевых сотрудников с ростом стоимости компании. На исходной базе 100 млн акций 10 млн расчётных единиц экономически соответствуют 10% всех акций: 9 млн распределяются планово за пять лет, ещё 1 млн остаётся отдельным резервом СД. В начале каждого года СД утверждает пакет и число единиц. После года заработанное число определяется автоматически по двум КПЭ, без повторного решения и пересчёта цены.</w:t>
             </w:r>
           </w:p>
         </w:tc>
@@ -69,6 +72,9 @@
         <w:pStyle w:val="Heading1"/>
       </w:pPr>
       <w:r>
+        <w:rPr>
+          <w:i w:val="0"/>
+        </w:rPr>
         <w:t>Каркас программы — в восьми правилах</w:t>
       </w:r>
     </w:p>
@@ -88,10 +94,10 @@
         <w:rPr>
           <w:b/>
         </w:rPr>
-        <w:t>Два разных вида вознаграждения.</w:t>
-      </w:r>
-      <w:r>
-        <w:t xml:space="preserve"> Денежная премия отвечает за текущий результат. Долгосрочная программа участия в стоимости компании выдаётся дополнительно и связывает личный результат с ростом стоимости компании.</w:t>
+        <w:t>Денежная премия и долгосрочная программа — два разных вознаграждения.</w:t>
+      </w:r>
+      <w:r>
+        <w:t xml:space="preserve"> Премия отвечает за текущий результат. Долгосрочная программа выдаётся дополнительно и связывает личный результат с ростом стоимости компании.</w:t>
       </w:r>
     </w:p>
     <w:p>
@@ -110,10 +116,10 @@
         <w:rPr>
           <w:b/>
         </w:rPr>
-        <w:t>Сначала фиксируем пакет, потом начинаем годовой забег.</w:t>
-      </w:r>
-      <w:r>
-        <w:t xml:space="preserve"> До начала годового цикла Совет директоров поимённо утверждает участника, множитель пакета, цену единицы и целевое число единиц. Рост оценки в течение года не уменьшает это число.</w:t>
+        <w:t>Пакет фиксируется до начала годовой работы.</w:t>
+      </w:r>
+      <w:r>
+        <w:t xml:space="preserve"> СД поимённо утверждает участника, размер пакета, цену единицы и целевое число единиц. Пакет считается от полной годовой стоимости вознаграждения с учётом всех обязательных налогов и взносов.</w:t>
       </w:r>
     </w:p>
     <w:p>
@@ -132,10 +138,10 @@
         <w:rPr>
           <w:b/>
         </w:rPr>
-        <w:t>Следующий пакет не возникает автоматически.</w:t>
-      </w:r>
-      <w:r>
-        <w:t xml:space="preserve"> Решение принимается заново в начале каждого года. Прошлогоднее участие не гарантирует новый пакет и не гарантирует прежний размер.</w:t>
+        <w:t>После года число заработанных единиц определяется автоматически.</w:t>
+      </w:r>
+      <w:r>
+        <w:t xml:space="preserve"> Результат на 60% зависит от КПЭ компании и на 40% — от личного КПЭ. Повторного решения СД по текущему пакету и пересчёта по новой оценке нет; заработанное число не может превысить целевое.</w:t>
       </w:r>
     </w:p>
     <w:p>
@@ -154,10 +160,10 @@
         <w:rPr>
           <w:b/>
         </w:rPr>
-        <w:t>Размер считается от полной годовой стоимости вознаграждения.</w:t>
-      </w:r>
-      <w:r>
-        <w:t xml:space="preserve"> Основа равна месячному окладу до удержаний × 12 × 1,15. Множители — 0,25 / 0,50 / 0,75 / 1,00; для старших ролей минимум 0,50, для младших минимум 0,25.</w:t>
+        <w:t>Следующий пакет не возникает автоматически.</w:t>
+      </w:r>
+      <w:r>
+        <w:t xml:space="preserve"> В начале каждого нового года СД заново утверждает участника и размер пакета. Прошлогоднее участие не гарантирует новый пакет или прежний размер.</w:t>
       </w:r>
     </w:p>
     <w:p>
@@ -176,10 +182,10 @@
         <w:rPr>
           <w:b/>
         </w:rPr>
-        <w:t>Результат подтверждается после завершения года.</w:t>
-      </w:r>
-      <w:r>
-        <w:t xml:space="preserve"> На 60% он зависит от целей компании и на 40% — от личных целей. Подтверждённое число единиц не может превысить целевое. В расчётной модели результат каждого участника равен 100%.</w:t>
+        <w:t>Размер пакета выражается в годовых вознаграждениях.</w:t>
+      </w:r>
+      <w:r>
+        <w:t xml:space="preserve"> Допустимые множители — 0,25 / 0,50 / 0,75 / 1,00 от полной годовой стоимости с налогами и взносами. Для старших ролей минимум 0,50, для младших — 0,25.</w:t>
       </w:r>
     </w:p>
     <w:p>
@@ -198,10 +204,10 @@
         <w:rPr>
           <w:b/>
         </w:rPr>
-        <w:t>Каждый подтверждённый пакет закрепляется отдельно за 36 месяцев.</w:t>
-      </w:r>
-      <w:r>
-        <w:t xml:space="preserve"> В конце каждого полного квартала закрепляется 1/12 пакета. Новый пакет может начаться, пока права по предыдущему ещё продолжают закрепляться.</w:t>
+        <w:t>Каждый заработанный пакет закрепляется отдельно за 36 месяцев.</w:t>
+      </w:r>
+      <w:r>
+        <w:t xml:space="preserve"> В конце каждого полного квартала закрепляется 1/12 пакета. Пакеты разных лет накладываются друг на друга, поэтому для их полного закрепления нужно оставаться в компании.</w:t>
       </w:r>
     </w:p>
     <w:p>
@@ -220,10 +226,10 @@
         <w:rPr>
           <w:b/>
         </w:rPr>
-        <w:t>Плановые выдачи — 9%, резерв Совета директоров — 1%.</w:t>
-      </w:r>
-      <w:r>
-        <w:t xml:space="preserve"> Годовые пределы составляют 4 / 2 / 2 / 1 / 0 млн исходных единиц. Ещё 1 млн единиц не распределяется автоматически и предназначен для будущих критичных назначений.</w:t>
+        <w:t>Плановые выдачи составляют 9%, резерв СД — 1%.</w:t>
+      </w:r>
+      <w:r>
+        <w:t xml:space="preserve"> Годовые пределы плановых пакетов — 4 / 2 / 1 / 1 / 1 млн исходных единиц в Г1–Г5. Ещё 1 млн единиц выдаётся только отдельным решением СД на будущие критичные назначения.</w:t>
       </w:r>
     </w:p>
     <w:p>
@@ -242,10 +248,10 @@
         <w:rPr>
           <w:b/>
         </w:rPr>
-        <w:t>Общий предел никогда не превышает 10 млн исходных единиц.</w:t>
-      </w:r>
-      <w:r>
-        <w:t xml:space="preserve"> Новые инвестиционные раунды размывают прежних владельцев и весь лимит программы одинаково. Автоматического восстановления процента после раундов нет.</w:t>
+        <w:t>Общий предел равен 10% всех акций на исходной базе.</w:t>
+      </w:r>
+      <w:r>
+        <w:t xml:space="preserve"> Это 10 млн единиц при исходной полностью разводнённой базе 100 млн. Новые инвестиционные раунды размывают прежних владельцев и единицы программы одинаково; лимит после раундов не восстанавливается.</w:t>
       </w:r>
     </w:p>
     <w:p>
@@ -253,6 +259,9 @@
         <w:pStyle w:val="Heading1"/>
       </w:pPr>
       <w:r>
+        <w:rPr>
+          <w:i w:val="0"/>
+        </w:rPr>
         <w:t>Как работает один год</w:t>
       </w:r>
     </w:p>
@@ -280,6 +289,7 @@
       <w:tr>
         <w:trPr>
           <w:tblHeader w:val="true"/>
+          <w:cantSplit/>
         </w:trPr>
         <w:tc>
           <w:tcPr>
@@ -293,14 +303,10 @@
             </w:tcMar>
           </w:tcPr>
           <w:p>
-            <w:pPr>
-              <w:jc w:val="left"/>
-            </w:pPr>
             <w:r>
               <w:rPr>
                 <w:b/>
                 <w:color w:val="FFFFFF"/>
-                <w:sz w:val="18"/>
               </w:rPr>
               <w:t>Момент</w:t>
             </w:r>
@@ -318,16 +324,12 @@
             </w:tcMar>
           </w:tcPr>
           <w:p>
-            <w:pPr>
-              <w:jc w:val="left"/>
-            </w:pPr>
             <w:r>
               <w:rPr>
                 <w:b/>
                 <w:color w:val="FFFFFF"/>
-                <w:sz w:val="18"/>
               </w:rPr>
-              <w:t>Решение</w:t>
+              <w:t>Механика</w:t>
             </w:r>
           </w:p>
         </w:tc>
@@ -343,14 +345,10 @@
             </w:tcMar>
           </w:tcPr>
           <w:p>
-            <w:pPr>
-              <w:jc w:val="left"/>
-            </w:pPr>
             <w:r>
               <w:rPr>
                 <w:b/>
                 <w:color w:val="FFFFFF"/>
-                <w:sz w:val="18"/>
               </w:rPr>
               <w:t>Что видит сотрудник</w:t>
             </w:r>
@@ -368,21 +366,20 @@
             </w:tcMar>
           </w:tcPr>
           <w:p>
-            <w:pPr>
-              <w:jc w:val="left"/>
-            </w:pPr>
             <w:r>
               <w:rPr>
                 <w:b/>
                 <w:color w:val="FFFFFF"/>
-                <w:sz w:val="18"/>
               </w:rPr>
-              <w:t>Что контролирует СД</w:t>
-            </w:r>
-          </w:p>
-        </w:tc>
-      </w:tr>
-      <w:tr>
+              <w:t>Роль СД</w:t>
+            </w:r>
+          </w:p>
+        </w:tc>
+      </w:tr>
+      <w:tr>
+        <w:trPr>
+          <w:cantSplit/>
+        </w:trPr>
         <w:tc>
           <w:tcPr>
             <w:tcW w:type="dxa" w:w="1247"/>
@@ -395,9 +392,6 @@
           </w:tcPr>
           <w:p>
             <w:r>
-              <w:rPr>
-                <w:sz w:val="18"/>
-              </w:rPr>
               <w:t>Начало года</w:t>
             </w:r>
           </w:p>
@@ -413,14 +407,8 @@
             </w:tcMar>
           </w:tcPr>
           <w:p>
-            <w:pPr>
-              <w:jc w:val="left"/>
-            </w:pPr>
-            <w:r>
-              <w:rPr>
-                <w:sz w:val="18"/>
-              </w:rPr>
-              <w:t>Утверждаются участник, множитель, цена и целевое число единиц</w:t>
+            <w:r>
+              <w:t>СД утверждает участника, полный размер пакета, цену и целевое число единиц</w:t>
             </w:r>
           </w:p>
         </w:tc>
@@ -435,14 +423,8 @@
             </w:tcMar>
           </w:tcPr>
           <w:p>
-            <w:pPr>
-              <w:jc w:val="left"/>
-            </w:pPr>
-            <w:r>
-              <w:rPr>
-                <w:sz w:val="18"/>
-              </w:rPr>
-              <w:t>Заранее знает, за какой пакет работает</w:t>
+            <w:r>
+              <w:t>Заранее знает, за какой пакет и число единиц работает</w:t>
             </w:r>
           </w:p>
         </w:tc>
@@ -457,19 +439,16 @@
             </w:tcMar>
           </w:tcPr>
           <w:p>
-            <w:pPr>
-              <w:jc w:val="left"/>
-            </w:pPr>
-            <w:r>
-              <w:rPr>
-                <w:sz w:val="18"/>
-              </w:rPr>
+            <w:r>
               <w:t>Проверяет годовой предел и свободный остаток</w:t>
             </w:r>
           </w:p>
         </w:tc>
       </w:tr>
       <w:tr>
+        <w:trPr>
+          <w:cantSplit/>
+        </w:trPr>
         <w:tc>
           <w:tcPr>
             <w:tcW w:type="dxa" w:w="1247"/>
@@ -483,9 +462,6 @@
           </w:tcPr>
           <w:p>
             <w:r>
-              <w:rPr>
-                <w:sz w:val="18"/>
-              </w:rPr>
               <w:t>В течение года</w:t>
             </w:r>
           </w:p>
@@ -502,14 +478,8 @@
             <w:shd w:fill="EAF2F8"/>
           </w:tcPr>
           <w:p>
-            <w:pPr>
-              <w:jc w:val="left"/>
-            </w:pPr>
-            <w:r>
-              <w:rPr>
-                <w:sz w:val="18"/>
-              </w:rPr>
-              <w:t>Число целевых единиц не меняется</w:t>
+            <w:r>
+              <w:t>Целевое число единиц не меняется</w:t>
             </w:r>
           </w:p>
         </w:tc>
@@ -525,14 +495,8 @@
             <w:shd w:fill="EAF2F8"/>
           </w:tcPr>
           <w:p>
-            <w:pPr>
-              <w:jc w:val="left"/>
-            </w:pPr>
-            <w:r>
-              <w:rPr>
-                <w:sz w:val="18"/>
-              </w:rPr>
-              <w:t>Рост стоимости повышает возможную ценность пакета</w:t>
+            <w:r>
+              <w:t>Выполняет два КПЭ: 60% — компания, 40% — личный результат</w:t>
             </w:r>
           </w:p>
         </w:tc>
@@ -548,19 +512,16 @@
             <w:shd w:fill="EAF2F8"/>
           </w:tcPr>
           <w:p>
-            <w:pPr>
-              <w:jc w:val="left"/>
-            </w:pPr>
-            <w:r>
-              <w:rPr>
-                <w:sz w:val="18"/>
-              </w:rPr>
-              <w:t>Следит за целями компании и участника</w:t>
-            </w:r>
-          </w:p>
-        </w:tc>
-      </w:tr>
-      <w:tr>
+            <w:r>
+              <w:t>Ручного изменения цены или пакета нет</w:t>
+            </w:r>
+          </w:p>
+        </w:tc>
+      </w:tr>
+      <w:tr>
+        <w:trPr>
+          <w:cantSplit/>
+        </w:trPr>
         <w:tc>
           <w:tcPr>
             <w:tcW w:type="dxa" w:w="1247"/>
@@ -573,9 +534,6 @@
           </w:tcPr>
           <w:p>
             <w:r>
-              <w:rPr>
-                <w:sz w:val="18"/>
-              </w:rPr>
               <w:t>После года</w:t>
             </w:r>
           </w:p>
@@ -591,14 +549,8 @@
             </w:tcMar>
           </w:tcPr>
           <w:p>
-            <w:pPr>
-              <w:jc w:val="left"/>
-            </w:pPr>
-            <w:r>
-              <w:rPr>
-                <w:sz w:val="18"/>
-              </w:rPr>
-              <w:t>Подтверждается коэффициент результата и заработанное число единиц</w:t>
+            <w:r>
+              <w:t>Формула автоматически определяет заработанное число единиц</w:t>
             </w:r>
           </w:p>
         </w:tc>
@@ -613,14 +565,8 @@
             </w:tcMar>
           </w:tcPr>
           <w:p>
-            <w:pPr>
-              <w:jc w:val="left"/>
-            </w:pPr>
-            <w:r>
-              <w:rPr>
-                <w:sz w:val="18"/>
-              </w:rPr>
-              <w:t>Получает итог по завершённому циклу</w:t>
+            <w:r>
+              <w:t>Получает результат завершённого цикла без пересчёта по новой оценке</w:t>
             </w:r>
           </w:p>
         </w:tc>
@@ -635,19 +581,16 @@
             </w:tcMar>
           </w:tcPr>
           <w:p>
-            <w:pPr>
-              <w:jc w:val="left"/>
-            </w:pPr>
-            <w:r>
-              <w:rPr>
-                <w:sz w:val="18"/>
-              </w:rPr>
-              <w:t>Освобождает незаработанную часть</w:t>
-            </w:r>
-          </w:p>
-        </w:tc>
-      </w:tr>
-      <w:tr>
+            <w:r>
+              <w:t>Незаработанная часть автоматически возвращается в свободный остаток</w:t>
+            </w:r>
+          </w:p>
+        </w:tc>
+      </w:tr>
+      <w:tr>
+        <w:trPr>
+          <w:cantSplit/>
+        </w:trPr>
         <w:tc>
           <w:tcPr>
             <w:tcW w:type="dxa" w:w="1247"/>
@@ -661,9 +604,6 @@
           </w:tcPr>
           <w:p>
             <w:r>
-              <w:rPr>
-                <w:sz w:val="18"/>
-              </w:rPr>
               <w:t>Следующие 36 месяцев</w:t>
             </w:r>
           </w:p>
@@ -680,13 +620,7 @@
             <w:shd w:fill="EAF2F8"/>
           </w:tcPr>
           <w:p>
-            <w:pPr>
-              <w:jc w:val="left"/>
-            </w:pPr>
-            <w:r>
-              <w:rPr>
-                <w:sz w:val="18"/>
-              </w:rPr>
+            <w:r>
               <w:t>Права закрепляются по 1/12 за полный квартал</w:t>
             </w:r>
           </w:p>
@@ -703,13 +637,7 @@
             <w:shd w:fill="EAF2F8"/>
           </w:tcPr>
           <w:p>
-            <w:pPr>
-              <w:jc w:val="left"/>
-            </w:pPr>
-            <w:r>
-              <w:rPr>
-                <w:sz w:val="18"/>
-              </w:rPr>
+            <w:r>
               <w:t>Сохраняет уже закреплённую часть</w:t>
             </w:r>
           </w:p>
@@ -726,19 +654,16 @@
             <w:shd w:fill="EAF2F8"/>
           </w:tcPr>
           <w:p>
-            <w:pPr>
-              <w:jc w:val="left"/>
-            </w:pPr>
-            <w:r>
-              <w:rPr>
-                <w:sz w:val="18"/>
-              </w:rPr>
-              <w:t>Возвращает незакреплённую часть при уходе по правилам программы</w:t>
-            </w:r>
-          </w:p>
-        </w:tc>
-      </w:tr>
-      <w:tr>
+            <w:r>
+              <w:t>Применяет заранее утверждённые правила при уходе</w:t>
+            </w:r>
+          </w:p>
+        </w:tc>
+      </w:tr>
+      <w:tr>
+        <w:trPr>
+          <w:cantSplit/>
+        </w:trPr>
         <w:tc>
           <w:tcPr>
             <w:tcW w:type="dxa" w:w="1247"/>
@@ -751,9 +676,6 @@
           </w:tcPr>
           <w:p>
             <w:r>
-              <w:rPr>
-                <w:sz w:val="18"/>
-              </w:rPr>
               <w:t>Начало следующего года</w:t>
             </w:r>
           </w:p>
@@ -769,14 +691,8 @@
             </w:tcMar>
           </w:tcPr>
           <w:p>
-            <w:pPr>
-              <w:jc w:val="left"/>
-            </w:pPr>
-            <w:r>
-              <w:rPr>
-                <w:sz w:val="18"/>
-              </w:rPr>
-              <w:t>Новое поимённое решение</w:t>
+            <w:r>
+              <w:t>СД принимает новое поимённое решение</w:t>
             </w:r>
           </w:p>
         </w:tc>
@@ -791,13 +707,7 @@
             </w:tcMar>
           </w:tcPr>
           <w:p>
-            <w:pPr>
-              <w:jc w:val="left"/>
-            </w:pPr>
-            <w:r>
-              <w:rPr>
-                <w:sz w:val="18"/>
-              </w:rPr>
+            <w:r>
               <w:t>Нет автоматического права на новый пакет</w:t>
             </w:r>
           </w:p>
@@ -813,13 +723,7 @@
             </w:tcMar>
           </w:tcPr>
           <w:p>
-            <w:pPr>
-              <w:jc w:val="left"/>
-            </w:pPr>
-            <w:r>
-              <w:rPr>
-                <w:sz w:val="18"/>
-              </w:rPr>
+            <w:r>
               <w:t>Может увеличить, уменьшить или не выдать новый пакет</w:t>
             </w:r>
           </w:p>
@@ -836,6 +740,9 @@
         <w:pStyle w:val="Heading1"/>
       </w:pPr>
       <w:r>
+        <w:rPr>
+          <w:i w:val="0"/>
+        </w:rPr>
         <w:t>Формулы</w:t>
       </w:r>
     </w:p>
@@ -850,6 +757,9 @@
         <w:gridCol w:w="9866"/>
       </w:tblGrid>
       <w:tr>
+        <w:trPr>
+          <w:cantSplit/>
+        </w:trPr>
         <w:tc>
           <w:tcPr>
             <w:tcW w:type="dxa" w:w="9866"/>
@@ -863,16 +773,16 @@
             <w:vAlign w:val="center"/>
           </w:tcPr>
           <w:p>
+            <w:r/>
             <w:r>
               <w:rPr>
                 <w:b/>
-                <w:color w:val="17365D"/>
               </w:rPr>
-              <w:t>1. Полная годовая стоимость фиксированного вознаграждения</w:t>
+              <w:t>1. Полная годовая стоимость вознаграждения</w:t>
             </w:r>
             <w:r>
               <w:br/>
-              <w:t>Месячный оклад до удержаний × 12 × 1,15</w:t>
+              <w:t>Годовая сумма по окладу с учётом всех применимых налогов и взносов</w:t>
             </w:r>
           </w:p>
         </w:tc>
@@ -894,6 +804,9 @@
         <w:gridCol w:w="9866"/>
       </w:tblGrid>
       <w:tr>
+        <w:trPr>
+          <w:cantSplit/>
+        </w:trPr>
         <w:tc>
           <w:tcPr>
             <w:tcW w:type="dxa" w:w="9866"/>
@@ -907,10 +820,10 @@
             <w:vAlign w:val="center"/>
           </w:tcPr>
           <w:p>
+            <w:r/>
             <w:r>
               <w:rPr>
                 <w:b/>
-                <w:color w:val="17365D"/>
               </w:rPr>
               <w:t>2. Целевое число единиц в начале года</w:t>
             </w:r>
@@ -938,6 +851,9 @@
         <w:gridCol w:w="9866"/>
       </w:tblGrid>
       <w:tr>
+        <w:trPr>
+          <w:cantSplit/>
+        </w:trPr>
         <w:tc>
           <w:tcPr>
             <w:tcW w:type="dxa" w:w="9866"/>
@@ -951,12 +867,12 @@
             <w:vAlign w:val="center"/>
           </w:tcPr>
           <w:p>
+            <w:r/>
             <w:r>
               <w:rPr>
                 <w:b/>
-                <w:color w:val="17365D"/>
               </w:rPr>
-              <w:t>3. Подтверждённое число единиц после года</w:t>
+              <w:t>3. Заработанное число единиц после года</w:t>
             </w:r>
             <w:r>
               <w:br/>
@@ -980,7 +896,7 @@
           <w:i/>
           <w:color w:val="7F7F7F"/>
         </w:rPr>
-        <w:t>Цена и целевое число единиц после начала года не пересчитываются по более высокой оценке. Иначе сотрудник получил бы меньше единиц именно из-за роста, который помог создать.</w:t>
+        <w:t>Пример: при целевом пакете 100 000 единиц, результате компании 80% и личном результате 90% итог равен 84%. Автоматически зарабатывается 84 000 единиц. Цена и исходный пакет не пересчитываются.</w:t>
       </w:r>
     </w:p>
     <w:p>
@@ -988,7 +904,10 @@
         <w:pStyle w:val="Heading1"/>
       </w:pPr>
       <w:r>
-        <w:t>9% плановых выдач + 1% резерв Совета директоров</w:t>
+        <w:rPr>
+          <w:i w:val="0"/>
+        </w:rPr>
+        <w:t>10% всех акций на исходной базе: 9% планово + 1% резерв СД</w:t>
       </w:r>
     </w:p>
     <w:tbl>
@@ -1015,6 +934,7 @@
       <w:tr>
         <w:trPr>
           <w:tblHeader w:val="true"/>
+          <w:cantSplit/>
         </w:trPr>
         <w:tc>
           <w:tcPr>
@@ -1118,6 +1038,9 @@
         </w:tc>
       </w:tr>
       <w:tr>
+        <w:trPr>
+          <w:cantSplit/>
+        </w:trPr>
         <w:tc>
           <w:tcPr>
             <w:tcW w:type="dxa" w:w="1701"/>
@@ -1130,10 +1053,7 @@
           </w:tcPr>
           <w:p>
             <w:r>
-              <w:rPr>
-                <w:sz w:val="18"/>
-              </w:rPr>
-              <w:t>Y1 / 2027</w:t>
+              <w:t>Г1 / 2027</w:t>
             </w:r>
           </w:p>
         </w:tc>
@@ -1148,13 +1068,7 @@
             </w:tcMar>
           </w:tcPr>
           <w:p>
-            <w:pPr>
-              <w:jc w:val="left"/>
-            </w:pPr>
-            <w:r>
-              <w:rPr>
-                <w:sz w:val="18"/>
-              </w:rPr>
+            <w:r>
               <w:t>4 000 000 ед.</w:t>
             </w:r>
           </w:p>
@@ -1170,13 +1084,7 @@
             </w:tcMar>
           </w:tcPr>
           <w:p>
-            <w:pPr>
-              <w:jc w:val="left"/>
-            </w:pPr>
-            <w:r>
-              <w:rPr>
-                <w:sz w:val="18"/>
-              </w:rPr>
+            <w:r>
               <w:t>4 000 000 ед.</w:t>
             </w:r>
           </w:p>
@@ -1192,19 +1100,16 @@
             </w:tcMar>
           </w:tcPr>
           <w:p>
-            <w:pPr>
-              <w:jc w:val="left"/>
-            </w:pPr>
-            <w:r>
-              <w:rPr>
-                <w:sz w:val="18"/>
-              </w:rPr>
+            <w:r>
               <w:t>Плановые пакеты</w:t>
             </w:r>
           </w:p>
         </w:tc>
       </w:tr>
       <w:tr>
+        <w:trPr>
+          <w:cantSplit/>
+        </w:trPr>
         <w:tc>
           <w:tcPr>
             <w:tcW w:type="dxa" w:w="1701"/>
@@ -1218,10 +1123,7 @@
           </w:tcPr>
           <w:p>
             <w:r>
-              <w:rPr>
-                <w:sz w:val="18"/>
-              </w:rPr>
-              <w:t>Y2 / 2028</w:t>
+              <w:t>Г2 / 2028</w:t>
             </w:r>
           </w:p>
         </w:tc>
@@ -1237,13 +1139,7 @@
             <w:shd w:fill="EAF2F8"/>
           </w:tcPr>
           <w:p>
-            <w:pPr>
-              <w:jc w:val="left"/>
-            </w:pPr>
-            <w:r>
-              <w:rPr>
-                <w:sz w:val="18"/>
-              </w:rPr>
+            <w:r>
               <w:t>2 000 000 ед.</w:t>
             </w:r>
           </w:p>
@@ -1260,13 +1156,7 @@
             <w:shd w:fill="EAF2F8"/>
           </w:tcPr>
           <w:p>
-            <w:pPr>
-              <w:jc w:val="left"/>
-            </w:pPr>
-            <w:r>
-              <w:rPr>
-                <w:sz w:val="18"/>
-              </w:rPr>
+            <w:r>
               <w:t>6 000 000 ед.</w:t>
             </w:r>
           </w:p>
@@ -1283,19 +1173,16 @@
             <w:shd w:fill="EAF2F8"/>
           </w:tcPr>
           <w:p>
-            <w:pPr>
-              <w:jc w:val="left"/>
-            </w:pPr>
-            <w:r>
-              <w:rPr>
-                <w:sz w:val="18"/>
-              </w:rPr>
+            <w:r>
               <w:t>Плановые пакеты</w:t>
             </w:r>
           </w:p>
         </w:tc>
       </w:tr>
       <w:tr>
+        <w:trPr>
+          <w:cantSplit/>
+        </w:trPr>
         <w:tc>
           <w:tcPr>
             <w:tcW w:type="dxa" w:w="1701"/>
@@ -1308,10 +1195,7 @@
           </w:tcPr>
           <w:p>
             <w:r>
-              <w:rPr>
-                <w:sz w:val="18"/>
-              </w:rPr>
-              <w:t>Y3 / 2029</w:t>
+              <w:t>Г3 / 2029</w:t>
             </w:r>
           </w:p>
         </w:tc>
@@ -1326,14 +1210,8 @@
             </w:tcMar>
           </w:tcPr>
           <w:p>
-            <w:pPr>
-              <w:jc w:val="left"/>
-            </w:pPr>
-            <w:r>
-              <w:rPr>
-                <w:sz w:val="18"/>
-              </w:rPr>
-              <w:t>2 000 000 ед.</w:t>
+            <w:r>
+              <w:t>1 000 000 ед.</w:t>
             </w:r>
           </w:p>
         </w:tc>
@@ -1348,13 +1226,79 @@
             </w:tcMar>
           </w:tcPr>
           <w:p>
-            <w:pPr>
-              <w:jc w:val="left"/>
-            </w:pPr>
-            <w:r>
-              <w:rPr>
-                <w:sz w:val="18"/>
-              </w:rPr>
+            <w:r>
+              <w:t>7 000 000 ед.</w:t>
+            </w:r>
+          </w:p>
+        </w:tc>
+        <w:tc>
+          <w:tcPr>
+            <w:tcW w:type="dxa" w:w="3685"/>
+            <w:tcMar>
+              <w:top w:w="80" w:type="dxa"/>
+              <w:start w:w="100" w:type="dxa"/>
+              <w:bottom w:w="80" w:type="dxa"/>
+              <w:end w:w="100" w:type="dxa"/>
+            </w:tcMar>
+          </w:tcPr>
+          <w:p>
+            <w:r>
+              <w:t>Плановые пакеты</w:t>
+            </w:r>
+          </w:p>
+        </w:tc>
+      </w:tr>
+      <w:tr>
+        <w:trPr>
+          <w:cantSplit/>
+        </w:trPr>
+        <w:tc>
+          <w:tcPr>
+            <w:tcW w:type="dxa" w:w="1701"/>
+            <w:tcMar>
+              <w:top w:w="80" w:type="dxa"/>
+              <w:start w:w="100" w:type="dxa"/>
+              <w:bottom w:w="80" w:type="dxa"/>
+              <w:end w:w="100" w:type="dxa"/>
+            </w:tcMar>
+            <w:shd w:fill="EAF2F8"/>
+          </w:tcPr>
+          <w:p>
+            <w:r>
+              <w:t>Г4 / 2030</w:t>
+            </w:r>
+          </w:p>
+        </w:tc>
+        <w:tc>
+          <w:tcPr>
+            <w:tcW w:type="dxa" w:w="1871"/>
+            <w:tcMar>
+              <w:top w:w="80" w:type="dxa"/>
+              <w:start w:w="100" w:type="dxa"/>
+              <w:bottom w:w="80" w:type="dxa"/>
+              <w:end w:w="100" w:type="dxa"/>
+            </w:tcMar>
+            <w:shd w:fill="EAF2F8"/>
+          </w:tcPr>
+          <w:p>
+            <w:r>
+              <w:t>1 000 000 ед.</w:t>
+            </w:r>
+          </w:p>
+        </w:tc>
+        <w:tc>
+          <w:tcPr>
+            <w:tcW w:type="dxa" w:w="2324"/>
+            <w:tcMar>
+              <w:top w:w="80" w:type="dxa"/>
+              <w:start w:w="100" w:type="dxa"/>
+              <w:bottom w:w="80" w:type="dxa"/>
+              <w:end w:w="100" w:type="dxa"/>
+            </w:tcMar>
+            <w:shd w:fill="EAF2F8"/>
+          </w:tcPr>
+          <w:p>
+            <w:r>
               <w:t>8 000 000 ед.</w:t>
             </w:r>
           </w:p>
@@ -1368,21 +1312,19 @@
               <w:bottom w:w="80" w:type="dxa"/>
               <w:end w:w="100" w:type="dxa"/>
             </w:tcMar>
-          </w:tcPr>
-          <w:p>
-            <w:pPr>
-              <w:jc w:val="left"/>
-            </w:pPr>
-            <w:r>
-              <w:rPr>
-                <w:sz w:val="18"/>
-              </w:rPr>
+            <w:shd w:fill="EAF2F8"/>
+          </w:tcPr>
+          <w:p>
+            <w:r>
               <w:t>Плановые пакеты</w:t>
             </w:r>
           </w:p>
         </w:tc>
       </w:tr>
       <w:tr>
+        <w:trPr>
+          <w:cantSplit/>
+        </w:trPr>
         <w:tc>
           <w:tcPr>
             <w:tcW w:type="dxa" w:w="1701"/>
@@ -1392,14 +1334,10 @@
               <w:bottom w:w="80" w:type="dxa"/>
               <w:end w:w="100" w:type="dxa"/>
             </w:tcMar>
-            <w:shd w:fill="EAF2F8"/>
-          </w:tcPr>
-          <w:p>
-            <w:r>
-              <w:rPr>
-                <w:sz w:val="18"/>
-              </w:rPr>
-              <w:t>Y4 / 2030</w:t>
+          </w:tcPr>
+          <w:p>
+            <w:r>
+              <w:t>Г5 / 2031</w:t>
             </w:r>
           </w:p>
         </w:tc>
@@ -1412,16 +1350,9 @@
               <w:bottom w:w="80" w:type="dxa"/>
               <w:end w:w="100" w:type="dxa"/>
             </w:tcMar>
-            <w:shd w:fill="EAF2F8"/>
-          </w:tcPr>
-          <w:p>
-            <w:pPr>
-              <w:jc w:val="left"/>
-            </w:pPr>
-            <w:r>
-              <w:rPr>
-                <w:sz w:val="18"/>
-              </w:rPr>
+          </w:tcPr>
+          <w:p>
+            <w:r>
               <w:t>1 000 000 ед.</w:t>
             </w:r>
           </w:p>
@@ -1435,16 +1366,9 @@
               <w:bottom w:w="80" w:type="dxa"/>
               <w:end w:w="100" w:type="dxa"/>
             </w:tcMar>
-            <w:shd w:fill="EAF2F8"/>
-          </w:tcPr>
-          <w:p>
-            <w:pPr>
-              <w:jc w:val="left"/>
-            </w:pPr>
-            <w:r>
-              <w:rPr>
-                <w:sz w:val="18"/>
-              </w:rPr>
+          </w:tcPr>
+          <w:p>
+            <w:r>
               <w:t>9 000 000 ед.</w:t>
             </w:r>
           </w:p>
@@ -1458,22 +1382,18 @@
               <w:bottom w:w="80" w:type="dxa"/>
               <w:end w:w="100" w:type="dxa"/>
             </w:tcMar>
-            <w:shd w:fill="EAF2F8"/>
-          </w:tcPr>
-          <w:p>
-            <w:pPr>
-              <w:jc w:val="left"/>
-            </w:pPr>
-            <w:r>
-              <w:rPr>
-                <w:sz w:val="18"/>
-              </w:rPr>
+          </w:tcPr>
+          <w:p>
+            <w:r>
               <w:t>Плановые пакеты</w:t>
             </w:r>
           </w:p>
         </w:tc>
       </w:tr>
       <w:tr>
+        <w:trPr>
+          <w:cantSplit/>
+        </w:trPr>
         <w:tc>
           <w:tcPr>
             <w:tcW w:type="dxa" w:w="1701"/>
@@ -1483,13 +1403,11 @@
               <w:bottom w:w="80" w:type="dxa"/>
               <w:end w:w="100" w:type="dxa"/>
             </w:tcMar>
-          </w:tcPr>
-          <w:p>
-            <w:r>
-              <w:rPr>
-                <w:sz w:val="18"/>
-              </w:rPr>
-              <w:t>Y5 / 2031</w:t>
+            <w:shd w:fill="EAF2F8"/>
+          </w:tcPr>
+          <w:p>
+            <w:r>
+              <w:t>Резерв СД</w:t>
             </w:r>
           </w:p>
         </w:tc>
@@ -1502,16 +1420,11 @@
               <w:bottom w:w="80" w:type="dxa"/>
               <w:end w:w="100" w:type="dxa"/>
             </w:tcMar>
-          </w:tcPr>
-          <w:p>
-            <w:pPr>
-              <w:jc w:val="left"/>
-            </w:pPr>
-            <w:r>
-              <w:rPr>
-                <w:sz w:val="18"/>
-              </w:rPr>
-              <w:t>0 ед.</w:t>
+            <w:shd w:fill="EAF2F8"/>
+          </w:tcPr>
+          <w:p>
+            <w:r>
+              <w:t>1 000 000 ед.</w:t>
             </w:r>
           </w:p>
         </w:tc>
@@ -1524,16 +1437,11 @@
               <w:bottom w:w="80" w:type="dxa"/>
               <w:end w:w="100" w:type="dxa"/>
             </w:tcMar>
-          </w:tcPr>
-          <w:p>
-            <w:pPr>
-              <w:jc w:val="left"/>
-            </w:pPr>
-            <w:r>
-              <w:rPr>
-                <w:sz w:val="18"/>
-              </w:rPr>
-              <w:t>9 000 000 ед.</w:t>
+            <w:shd w:fill="EAF2F8"/>
+          </w:tcPr>
+          <w:p>
+            <w:r>
+              <w:t>Общий предел 10 000 000 ед.</w:t>
             </w:r>
           </w:p>
         </w:tc>
@@ -1546,106 +1454,10 @@
               <w:bottom w:w="80" w:type="dxa"/>
               <w:end w:w="100" w:type="dxa"/>
             </w:tcMar>
-          </w:tcPr>
-          <w:p>
-            <w:pPr>
-              <w:jc w:val="left"/>
-            </w:pPr>
-            <w:r>
-              <w:rPr>
-                <w:sz w:val="18"/>
-              </w:rPr>
-              <w:t>Автоматических плановых выдач нет</w:t>
-            </w:r>
-          </w:p>
-        </w:tc>
-      </w:tr>
-      <w:tr>
-        <w:tc>
-          <w:tcPr>
-            <w:tcW w:type="dxa" w:w="1701"/>
-            <w:tcMar>
-              <w:top w:w="80" w:type="dxa"/>
-              <w:start w:w="100" w:type="dxa"/>
-              <w:bottom w:w="80" w:type="dxa"/>
-              <w:end w:w="100" w:type="dxa"/>
-            </w:tcMar>
-            <w:shd w:fill="EAF2F8"/>
-          </w:tcPr>
-          <w:p>
-            <w:r>
-              <w:rPr>
-                <w:sz w:val="18"/>
-              </w:rPr>
-              <w:t>Резерв СД</w:t>
-            </w:r>
-          </w:p>
-        </w:tc>
-        <w:tc>
-          <w:tcPr>
-            <w:tcW w:type="dxa" w:w="1871"/>
-            <w:tcMar>
-              <w:top w:w="80" w:type="dxa"/>
-              <w:start w:w="100" w:type="dxa"/>
-              <w:bottom w:w="80" w:type="dxa"/>
-              <w:end w:w="100" w:type="dxa"/>
-            </w:tcMar>
-            <w:shd w:fill="EAF2F8"/>
-          </w:tcPr>
-          <w:p>
-            <w:pPr>
-              <w:jc w:val="left"/>
-            </w:pPr>
-            <w:r>
-              <w:rPr>
-                <w:sz w:val="18"/>
-              </w:rPr>
-              <w:t>1 000 000 ед.</w:t>
-            </w:r>
-          </w:p>
-        </w:tc>
-        <w:tc>
-          <w:tcPr>
-            <w:tcW w:type="dxa" w:w="2324"/>
-            <w:tcMar>
-              <w:top w:w="80" w:type="dxa"/>
-              <w:start w:w="100" w:type="dxa"/>
-              <w:bottom w:w="80" w:type="dxa"/>
-              <w:end w:w="100" w:type="dxa"/>
-            </w:tcMar>
-            <w:shd w:fill="EAF2F8"/>
-          </w:tcPr>
-          <w:p>
-            <w:pPr>
-              <w:jc w:val="left"/>
-            </w:pPr>
-            <w:r>
-              <w:rPr>
-                <w:sz w:val="18"/>
-              </w:rPr>
-              <w:t>Общий предел 10 000 000 ед.</w:t>
-            </w:r>
-          </w:p>
-        </w:tc>
-        <w:tc>
-          <w:tcPr>
-            <w:tcW w:type="dxa" w:w="3685"/>
-            <w:tcMar>
-              <w:top w:w="80" w:type="dxa"/>
-              <w:start w:w="100" w:type="dxa"/>
-              <w:bottom w:w="80" w:type="dxa"/>
-              <w:end w:w="100" w:type="dxa"/>
-            </w:tcMar>
-            <w:shd w:fill="EAF2F8"/>
-          </w:tcPr>
-          <w:p>
-            <w:pPr>
-              <w:jc w:val="left"/>
-            </w:pPr>
-            <w:r>
-              <w:rPr>
-                <w:sz w:val="18"/>
-              </w:rPr>
+            <w:shd w:fill="EAF2F8"/>
+          </w:tcPr>
+          <w:p>
+            <w:r>
               <w:t>Будущие критичные назначения</w:t>
             </w:r>
           </w:p>
@@ -1670,7 +1482,7 @@
         <w:t xml:space="preserve">• </w:t>
       </w:r>
       <w:r>
-        <w:t>Проценты считаются от исходной полностью разводнённой базы 100 млн единиц на 01.01.2027.</w:t>
+        <w:t>10 млн единиц экономически соответствуют 10% всех акций на исходной полностью разводнённой базе 100 млн на 01.01.2027.</w:t>
       </w:r>
     </w:p>
     <w:p>
@@ -1686,7 +1498,7 @@
         <w:t xml:space="preserve">• </w:t>
       </w:r>
       <w:r>
-        <w:t>После инвестиционных раундов 1 млн единиц резерва уже не равен 1% капитала на шестой год: расчётная доля снижается примерно до 0,72% в базовом и 0,57% в осторожном варианте.</w:t>
+        <w:t>Инвестиционные раунды размывают всех прежних владельцев и единицы программы одинаково. Годовые пределы заданы в исходных единицах и после раундов не восстанавливаются.</w:t>
       </w:r>
     </w:p>
     <w:p>
@@ -1702,7 +1514,7 @@
         <w:t xml:space="preserve">• </w:t>
       </w:r>
       <w:r>
-        <w:t>Количество участников не увеличивает максимальное размытие: предел определяется числом единиц, а не числом фамилий.</w:t>
+        <w:t>Не более 20 человек могут одновременно участвовать в программе. Число участников не меняет общий предел: его определяет число единиц.</w:t>
       </w:r>
     </w:p>
     <w:p>
@@ -1710,6 +1522,9 @@
         <w:pStyle w:val="Heading1"/>
       </w:pPr>
       <w:r>
+        <w:rPr>
+          <w:i w:val="0"/>
+        </w:rPr>
         <w:t>Оценка, инвестиции и стоимость единицы</w:t>
       </w:r>
     </w:p>
@@ -1735,6 +1550,7 @@
       <w:tr>
         <w:trPr>
           <w:tblHeader w:val="true"/>
+          <w:cantSplit/>
         </w:trPr>
         <w:tc>
           <w:tcPr>
@@ -1788,6 +1604,9 @@
         </w:tc>
       </w:tr>
       <w:tr>
+        <w:trPr>
+          <w:cantSplit/>
+        </w:trPr>
         <w:tc>
           <w:tcPr>
             <w:tcW w:type="dxa" w:w="4649"/>
@@ -1800,9 +1619,6 @@
           </w:tcPr>
           <w:p>
             <w:r>
-              <w:rPr>
-                <w:sz w:val="18"/>
-              </w:rPr>
               <w:t>Начало программы</w:t>
             </w:r>
           </w:p>
@@ -1818,19 +1634,16 @@
             </w:tcMar>
           </w:tcPr>
           <w:p>
-            <w:pPr>
-              <w:jc w:val="left"/>
-            </w:pPr>
-            <w:r>
-              <w:rPr>
-                <w:sz w:val="18"/>
-              </w:rPr>
+            <w:r>
               <w:t>1 января 2027 года</w:t>
             </w:r>
           </w:p>
         </w:tc>
       </w:tr>
       <w:tr>
+        <w:trPr>
+          <w:cantSplit/>
+        </w:trPr>
         <w:tc>
           <w:tcPr>
             <w:tcW w:type="dxa" w:w="4649"/>
@@ -1844,10 +1657,7 @@
           </w:tcPr>
           <w:p>
             <w:r>
-              <w:rPr>
-                <w:sz w:val="18"/>
-              </w:rPr>
-              <w:t>Оценка после вложения на старте</w:t>
+              <w:t>Индикативная стоимость капитала на старте</w:t>
             </w:r>
           </w:p>
         </w:tc>
@@ -1863,19 +1673,16 @@
             <w:shd w:fill="EAF2F8"/>
           </w:tcPr>
           <w:p>
-            <w:pPr>
-              <w:jc w:val="left"/>
-            </w:pPr>
-            <w:r>
-              <w:rPr>
-                <w:sz w:val="18"/>
-              </w:rPr>
+            <w:r>
               <w:t>1,6 млрд ₽</w:t>
             </w:r>
           </w:p>
         </w:tc>
       </w:tr>
       <w:tr>
+        <w:trPr>
+          <w:cantSplit/>
+        </w:trPr>
         <w:tc>
           <w:tcPr>
             <w:tcW w:type="dxa" w:w="4649"/>
@@ -1888,9 +1695,6 @@
           </w:tcPr>
           <w:p>
             <w:r>
-              <w:rPr>
-                <w:sz w:val="18"/>
-              </w:rPr>
               <w:t>Исходная полностью разводнённая база</w:t>
             </w:r>
           </w:p>
@@ -1906,19 +1710,16 @@
             </w:tcMar>
           </w:tcPr>
           <w:p>
-            <w:pPr>
-              <w:jc w:val="left"/>
-            </w:pPr>
-            <w:r>
-              <w:rPr>
-                <w:sz w:val="18"/>
-              </w:rPr>
+            <w:r>
               <w:t>100 млн единиц</w:t>
             </w:r>
           </w:p>
         </w:tc>
       </w:tr>
       <w:tr>
+        <w:trPr>
+          <w:cantSplit/>
+        </w:trPr>
         <w:tc>
           <w:tcPr>
             <w:tcW w:type="dxa" w:w="4649"/>
@@ -1932,10 +1733,7 @@
           </w:tcPr>
           <w:p>
             <w:r>
-              <w:rPr>
-                <w:sz w:val="18"/>
-              </w:rPr>
-              <w:t>Цена единицы Y1</w:t>
+              <w:t>Индикативная цена единицы Г1</w:t>
             </w:r>
           </w:p>
         </w:tc>
@@ -1951,19 +1749,16 @@
             <w:shd w:fill="EAF2F8"/>
           </w:tcPr>
           <w:p>
-            <w:pPr>
-              <w:jc w:val="left"/>
-            </w:pPr>
-            <w:r>
-              <w:rPr>
-                <w:sz w:val="18"/>
-              </w:rPr>
+            <w:r>
               <w:t>16 ₽</w:t>
             </w:r>
           </w:p>
         </w:tc>
       </w:tr>
       <w:tr>
+        <w:trPr>
+          <w:cantSplit/>
+        </w:trPr>
         <w:tc>
           <w:tcPr>
             <w:tcW w:type="dxa" w:w="4649"/>
@@ -1976,10 +1771,7 @@
           </w:tcPr>
           <w:p>
             <w:r>
-              <w:rPr>
-                <w:sz w:val="18"/>
-              </w:rPr>
-              <w:t>Деньги в компанию за раунды</w:t>
+              <w:t>Деньги в компанию за инвестиционные раунды</w:t>
             </w:r>
           </w:p>
         </w:tc>
@@ -1994,19 +1786,16 @@
             </w:tcMar>
           </w:tcPr>
           <w:p>
-            <w:pPr>
-              <w:jc w:val="left"/>
-            </w:pPr>
-            <w:r>
-              <w:rPr>
-                <w:sz w:val="18"/>
-              </w:rPr>
+            <w:r>
               <w:t>4 млрд ₽</w:t>
             </w:r>
           </w:p>
         </w:tc>
       </w:tr>
       <w:tr>
+        <w:trPr>
+          <w:cantSplit/>
+        </w:trPr>
         <w:tc>
           <w:tcPr>
             <w:tcW w:type="dxa" w:w="4649"/>
@@ -2020,10 +1809,7 @@
           </w:tcPr>
           <w:p>
             <w:r>
-              <w:rPr>
-                <w:sz w:val="18"/>
-              </w:rPr>
-              <w:t>Целевая оценка Y6 — базовый вариант</w:t>
+              <w:t>Сценарная стоимость капитала — базовый вариант</w:t>
             </w:r>
           </w:p>
         </w:tc>
@@ -2039,19 +1825,16 @@
             <w:shd w:fill="EAF2F8"/>
           </w:tcPr>
           <w:p>
-            <w:pPr>
-              <w:jc w:val="left"/>
-            </w:pPr>
-            <w:r>
-              <w:rPr>
-                <w:sz w:val="18"/>
-              </w:rPr>
+            <w:r>
               <w:t>16 млрд ₽</w:t>
             </w:r>
           </w:p>
         </w:tc>
       </w:tr>
       <w:tr>
+        <w:trPr>
+          <w:cantSplit/>
+        </w:trPr>
         <w:tc>
           <w:tcPr>
             <w:tcW w:type="dxa" w:w="4649"/>
@@ -2064,10 +1847,7 @@
           </w:tcPr>
           <w:p>
             <w:r>
-              <w:rPr>
-                <w:sz w:val="18"/>
-              </w:rPr>
-              <w:t>Целевая оценка Y6 — осторожный вариант</w:t>
+              <w:t>Сценарная стоимость капитала — осторожный вариант</w:t>
             </w:r>
           </w:p>
         </w:tc>
@@ -2082,19 +1862,16 @@
             </w:tcMar>
           </w:tcPr>
           <w:p>
-            <w:pPr>
-              <w:jc w:val="left"/>
-            </w:pPr>
-            <w:r>
-              <w:rPr>
-                <w:sz w:val="18"/>
-              </w:rPr>
+            <w:r>
               <w:t>8 млрд ₽</w:t>
             </w:r>
           </w:p>
         </w:tc>
       </w:tr>
       <w:tr>
+        <w:trPr>
+          <w:cantSplit/>
+        </w:trPr>
         <w:tc>
           <w:tcPr>
             <w:tcW w:type="dxa" w:w="4649"/>
@@ -2108,10 +1885,7 @@
           </w:tcPr>
           <w:p>
             <w:r>
-              <w:rPr>
-                <w:sz w:val="18"/>
-              </w:rPr>
-              <w:t>Участники модели</w:t>
+              <w:t>Участники расчётной модели</w:t>
             </w:r>
           </w:p>
         </w:tc>
@@ -2127,13 +1901,7 @@
             <w:shd w:fill="EAF2F8"/>
           </w:tcPr>
           <w:p>
-            <w:pPr>
-              <w:jc w:val="left"/>
-            </w:pPr>
-            <w:r>
-              <w:rPr>
-                <w:sz w:val="18"/>
-              </w:rPr>
+            <w:r>
               <w:t>Не более 20; никто не уходит; результат 100%</w:t>
             </w:r>
           </w:p>
@@ -2153,7 +1921,7 @@
         <w:rPr>
           <w:i w:val="0"/>
         </w:rPr>
-        <w:t>Для первого цикла используется цена завершённого открывающего раунда: 1,6 млрд ₽ ÷ 100 млн единиц = 16 ₽. Для следующих циклов цена фиксируется на начало года исходя из утверждённой стоимости капитала и полностью разводнённой базы на эту дату. Новые единицы инвесторов после вложения размывают все существующие единицы одинаково.</w:t>
+        <w:t>На 01.01.2027 в расчётной модели используется индикативная стоимость капитала 1,6 млрд ₽ и цена 16 ₽ за единицу. Для каждого следующего цикла цена фиксируется в начале года исходя из утверждённой оценки и полностью разводнённой базы на эту дату. В течение года цена и целевое число единиц не пересчитываются. Новые единицы инвесторов размывают все существующие единицы одинаково.</w:t>
       </w:r>
     </w:p>
     <w:p>
@@ -2166,7 +1934,10 @@
         <w:pStyle w:val="Heading1"/>
       </w:pPr>
       <w:r>
-        <w:t>Что показывает синхронизированный калькулятор</w:t>
+        <w:rPr>
+          <w:i w:val="0"/>
+        </w:rPr>
+        <w:t>Денежный масштаб программы в двух сценариях</w:t>
       </w:r>
     </w:p>
     <w:tbl>
@@ -2192,6 +1963,7 @@
       <w:tr>
         <w:trPr>
           <w:tblHeader w:val="true"/>
+          <w:cantSplit/>
         </w:trPr>
         <w:tc>
           <w:tcPr>
@@ -2205,14 +1977,10 @@
             </w:tcMar>
           </w:tcPr>
           <w:p>
-            <w:pPr>
-              <w:jc w:val="left"/>
-            </w:pPr>
             <w:r>
               <w:rPr>
                 <w:b/>
                 <w:color w:val="FFFFFF"/>
-                <w:sz w:val="18"/>
               </w:rPr>
               <w:t>Метрика</w:t>
             </w:r>
@@ -2230,14 +1998,10 @@
             </w:tcMar>
           </w:tcPr>
           <w:p>
-            <w:pPr>
-              <w:jc w:val="left"/>
-            </w:pPr>
             <w:r>
               <w:rPr>
                 <w:b/>
                 <w:color w:val="FFFFFF"/>
-                <w:sz w:val="18"/>
               </w:rPr>
               <w:t>Базовый вариант</w:t>
             </w:r>
@@ -2255,14 +2019,10 @@
             </w:tcMar>
           </w:tcPr>
           <w:p>
-            <w:pPr>
-              <w:jc w:val="left"/>
-            </w:pPr>
             <w:r>
               <w:rPr>
                 <w:b/>
                 <w:color w:val="FFFFFF"/>
-                <w:sz w:val="18"/>
               </w:rPr>
               <w:t>Осторожный вариант</w:t>
             </w:r>
@@ -2270,6 +2030,9 @@
         </w:tc>
       </w:tr>
       <w:tr>
+        <w:trPr>
+          <w:cantSplit/>
+        </w:trPr>
         <w:tc>
           <w:tcPr>
             <w:tcW w:type="dxa" w:w="4195"/>
@@ -2282,10 +2045,7 @@
           </w:tcPr>
           <w:p>
             <w:r>
-              <w:rPr>
-                <w:sz w:val="18"/>
-              </w:rPr>
-              <w:t>Оценка Y6</w:t>
+              <w:t>Сценарная стоимость капитала</w:t>
             </w:r>
           </w:p>
         </w:tc>
@@ -2300,13 +2060,7 @@
             </w:tcMar>
           </w:tcPr>
           <w:p>
-            <w:pPr>
-              <w:jc w:val="left"/>
-            </w:pPr>
-            <w:r>
-              <w:rPr>
-                <w:sz w:val="18"/>
-              </w:rPr>
+            <w:r>
               <w:t>16 млрд ₽</w:t>
             </w:r>
           </w:p>
@@ -2322,19 +2076,16 @@
             </w:tcMar>
           </w:tcPr>
           <w:p>
-            <w:pPr>
-              <w:jc w:val="left"/>
-            </w:pPr>
-            <w:r>
-              <w:rPr>
-                <w:sz w:val="18"/>
-              </w:rPr>
+            <w:r>
               <w:t>8 млрд ₽</w:t>
             </w:r>
           </w:p>
         </w:tc>
       </w:tr>
       <w:tr>
+        <w:trPr>
+          <w:cantSplit/>
+        </w:trPr>
         <w:tc>
           <w:tcPr>
             <w:tcW w:type="dxa" w:w="4195"/>
@@ -2348,9 +2099,6 @@
           </w:tcPr>
           <w:p>
             <w:r>
-              <w:rPr>
-                <w:sz w:val="18"/>
-              </w:rPr>
               <w:t>Выдано плановых единиц</w:t>
             </w:r>
           </w:p>
@@ -2367,14 +2115,8 @@
             <w:shd w:fill="EAF2F8"/>
           </w:tcPr>
           <w:p>
-            <w:pPr>
-              <w:jc w:val="left"/>
-            </w:pPr>
-            <w:r>
-              <w:rPr>
-                <w:sz w:val="18"/>
-              </w:rPr>
-              <w:t>8,614 млн</w:t>
+            <w:r>
+              <w:t>8,9769 млн</w:t>
             </w:r>
           </w:p>
         </w:tc>
@@ -2390,19 +2132,16 @@
             <w:shd w:fill="EAF2F8"/>
           </w:tcPr>
           <w:p>
-            <w:pPr>
-              <w:jc w:val="left"/>
-            </w:pPr>
-            <w:r>
-              <w:rPr>
-                <w:sz w:val="18"/>
-              </w:rPr>
-              <w:t>8,756 млн</w:t>
-            </w:r>
-          </w:p>
-        </w:tc>
-      </w:tr>
-      <w:tr>
+            <w:r>
+              <w:t>8,9709 млн</w:t>
+            </w:r>
+          </w:p>
+        </w:tc>
+      </w:tr>
+      <w:tr>
+        <w:trPr>
+          <w:cantSplit/>
+        </w:trPr>
         <w:tc>
           <w:tcPr>
             <w:tcW w:type="dxa" w:w="4195"/>
@@ -2415,9 +2154,6 @@
           </w:tcPr>
           <w:p>
             <w:r>
-              <w:rPr>
-                <w:sz w:val="18"/>
-              </w:rPr>
               <w:t>Использовано из доступных 9%</w:t>
             </w:r>
           </w:p>
@@ -2433,14 +2169,8 @@
             </w:tcMar>
           </w:tcPr>
           <w:p>
-            <w:pPr>
-              <w:jc w:val="left"/>
-            </w:pPr>
-            <w:r>
-              <w:rPr>
-                <w:sz w:val="18"/>
-              </w:rPr>
-              <w:t>95,7%</w:t>
+            <w:r>
+              <w:t>99,74%</w:t>
             </w:r>
           </w:p>
         </w:tc>
@@ -2455,19 +2185,16 @@
             </w:tcMar>
           </w:tcPr>
           <w:p>
-            <w:pPr>
-              <w:jc w:val="left"/>
-            </w:pPr>
-            <w:r>
-              <w:rPr>
-                <w:sz w:val="18"/>
-              </w:rPr>
-              <w:t>97,3%</w:t>
-            </w:r>
-          </w:p>
-        </w:tc>
-      </w:tr>
-      <w:tr>
+            <w:r>
+              <w:t>99,68%</w:t>
+            </w:r>
+          </w:p>
+        </w:tc>
+      </w:tr>
+      <w:tr>
+        <w:trPr>
+          <w:cantSplit/>
+        </w:trPr>
         <w:tc>
           <w:tcPr>
             <w:tcW w:type="dxa" w:w="4195"/>
@@ -2481,10 +2208,7 @@
           </w:tcPr>
           <w:p>
             <w:r>
-              <w:rPr>
-                <w:sz w:val="18"/>
-              </w:rPr>
-              <w:t>Получатели по циклам Y1–Y4</w:t>
+              <w:t>Получатели по циклам Г1–Г5</w:t>
             </w:r>
           </w:p>
         </w:tc>
@@ -2500,14 +2224,8 @@
             <w:shd w:fill="EAF2F8"/>
           </w:tcPr>
           <w:p>
-            <w:pPr>
-              <w:jc w:val="left"/>
-            </w:pPr>
-            <w:r>
-              <w:rPr>
-                <w:sz w:val="18"/>
-              </w:rPr>
-              <w:t>20 / 20 / 20 / 20</w:t>
+            <w:r>
+              <w:t>20 / 20 / 9 / 20 / 20</w:t>
             </w:r>
           </w:p>
         </w:tc>
@@ -2523,19 +2241,16 @@
             <w:shd w:fill="EAF2F8"/>
           </w:tcPr>
           <w:p>
-            <w:pPr>
-              <w:jc w:val="left"/>
-            </w:pPr>
-            <w:r>
-              <w:rPr>
-                <w:sz w:val="18"/>
-              </w:rPr>
-              <w:t>20 / 16 / 12 / 7</w:t>
-            </w:r>
-          </w:p>
-        </w:tc>
-      </w:tr>
-      <w:tr>
+            <w:r>
+              <w:t>20 / 16 / 5 / 7 / 7</w:t>
+            </w:r>
+          </w:p>
+        </w:tc>
+      </w:tr>
+      <w:tr>
+        <w:trPr>
+          <w:cantSplit/>
+        </w:trPr>
         <w:tc>
           <w:tcPr>
             <w:tcW w:type="dxa" w:w="4195"/>
@@ -2548,9 +2263,6 @@
           </w:tcPr>
           <w:p>
             <w:r>
-              <w:rPr>
-                <w:sz w:val="18"/>
-              </w:rPr>
               <w:t>Получили хотя бы один пакет</w:t>
             </w:r>
           </w:p>
@@ -2566,13 +2278,7 @@
             </w:tcMar>
           </w:tcPr>
           <w:p>
-            <w:pPr>
-              <w:jc w:val="left"/>
-            </w:pPr>
-            <w:r>
-              <w:rPr>
-                <w:sz w:val="18"/>
-              </w:rPr>
+            <w:r>
               <w:t>20</w:t>
             </w:r>
           </w:p>
@@ -2588,19 +2294,16 @@
             </w:tcMar>
           </w:tcPr>
           <w:p>
-            <w:pPr>
-              <w:jc w:val="left"/>
-            </w:pPr>
-            <w:r>
-              <w:rPr>
-                <w:sz w:val="18"/>
-              </w:rPr>
+            <w:r>
               <w:t>20</w:t>
             </w:r>
           </w:p>
         </w:tc>
       </w:tr>
       <w:tr>
+        <w:trPr>
+          <w:cantSplit/>
+        </w:trPr>
         <w:tc>
           <w:tcPr>
             <w:tcW w:type="dxa" w:w="4195"/>
@@ -2613,10 +2316,9 @@
           </w:tcPr>
           <w:p>
             <w:r>
-              <w:rPr>
-                <w:sz w:val="18"/>
-              </w:rPr>
-              <w:t>Медианная полная стоимость Y6</w:t>
+              <w:t>Полная стоимость участника:</w:t>
+              <w:br/>
+              <w:t>медиана / минимум / максимум</w:t>
             </w:r>
           </w:p>
         </w:tc>
@@ -2631,14 +2333,8 @@
             </w:tcMar>
           </w:tcPr>
           <w:p>
-            <w:pPr>
-              <w:jc w:val="left"/>
-            </w:pPr>
-            <w:r>
-              <w:rPr>
-                <w:sz w:val="18"/>
-              </w:rPr>
-              <w:t>37,8 млн ₽</w:t>
+            <w:r>
+              <w:t>33,9 / 19,0 / 131,4 млн ₽</w:t>
             </w:r>
           </w:p>
         </w:tc>
@@ -2653,19 +2349,16 @@
             </w:tcMar>
           </w:tcPr>
           <w:p>
-            <w:pPr>
-              <w:jc w:val="left"/>
-            </w:pPr>
-            <w:r>
-              <w:rPr>
-                <w:sz w:val="18"/>
-              </w:rPr>
-              <w:t>10,3 млн ₽</w:t>
-            </w:r>
-          </w:p>
-        </w:tc>
-      </w:tr>
-      <w:tr>
+            <w:r>
+              <w:t>10,7 / 4,4 / 73,6 млн ₽</w:t>
+            </w:r>
+          </w:p>
+        </w:tc>
+      </w:tr>
+      <w:tr>
+        <w:trPr>
+          <w:cantSplit/>
+        </w:trPr>
         <w:tc>
           <w:tcPr>
             <w:tcW w:type="dxa" w:w="4195"/>
@@ -2678,10 +2371,7 @@
           </w:tcPr>
           <w:p>
             <w:r>
-              <w:rPr>
-                <w:sz w:val="18"/>
-              </w:rPr>
-              <w:t>Полная стоимость всех пакетов Y6</w:t>
+              <w:t>Полная стоимость всех пакетов</w:t>
             </w:r>
           </w:p>
         </w:tc>
@@ -2696,14 +2386,8 @@
             </w:tcMar>
           </w:tcPr>
           <w:p>
-            <w:pPr>
-              <w:jc w:val="left"/>
-            </w:pPr>
-            <w:r>
-              <w:rPr>
-                <w:sz w:val="18"/>
-              </w:rPr>
-              <w:t>989,9 млн ₽</w:t>
+            <w:r>
+              <w:t>1 031,6 млн ₽</w:t>
             </w:r>
           </w:p>
         </w:tc>
@@ -2718,14 +2402,8 @@
             </w:tcMar>
           </w:tcPr>
           <w:p>
-            <w:pPr>
-              <w:jc w:val="left"/>
-            </w:pPr>
-            <w:r>
-              <w:rPr>
-                <w:sz w:val="18"/>
-              </w:rPr>
-              <w:t>397,7 млн ₽</w:t>
+            <w:r>
+              <w:t>407,4 млн ₽</w:t>
             </w:r>
           </w:p>
         </w:tc>
@@ -2745,7 +2423,7 @@
           <w:i/>
           <w:color w:val="7F7F7F"/>
         </w:rPr>
-        <w:t>Полная стоимость Y6 показывает стоимость всех подтверждённых единиц, как если бы они полностью закрепились. Это не означает фактическую выплату к этой дате.</w:t>
+        <w:t>По расчётной модели полная стоимость всех плановых пакетов составляет около 1,0 млрд ₽ в базовом и 407,4 млн ₽ в осторожном сценарии. Полная стоимость предполагает, что все заработанные единицы полностью закрепились. Закрепившаяся стоимость — только часть, срок которой уже прошёл. Выплата возникает лишь при отдельном событии выплаты и не привязана к окончанию Г5.</w:t>
       </w:r>
     </w:p>
     <w:p>
@@ -2753,7 +2431,10 @@
         <w:pStyle w:val="Heading1"/>
       </w:pPr>
       <w:r>
-        <w:t>Закрепление прав, выплаты и уход</w:t>
+        <w:rPr>
+          <w:i w:val="0"/>
+        </w:rPr>
+        <w:t>Закрепление прав, выплаты и особые ситуации</w:t>
       </w:r>
     </w:p>
     <w:p>
@@ -2769,7 +2450,7 @@
         <w:t xml:space="preserve">• </w:t>
       </w:r>
       <w:r>
-        <w:t>Каждый подтверждённый годовой пакет живёт отдельно и закрепляется по 1/12 за каждый полный квартал в течение 36 месяцев.</w:t>
+        <w:t>Каждый заработанный годовой пакет живёт отдельно и закрепляется по 1/12 за каждый полный квартал в течение 36 месяцев. Пакет Г5 продолжает закрепляться после окончания пятилетнего периода выдач.</w:t>
       </w:r>
     </w:p>
     <w:p>
@@ -2785,7 +2466,7 @@
         <w:t xml:space="preserve">• </w:t>
       </w:r>
       <w:r>
-        <w:t>До появления реальных акций расчётные единицы являются договорным правом: они не дают права голоса и не являются долей в ООО.</w:t>
+        <w:t>До передачи реальных акций расчётные единицы являются договорным правом: они не дают права голоса, не являются акцией или долей в ООО и не означают автоматическую передачу ценных бумаг.</w:t>
       </w:r>
     </w:p>
     <w:p>
@@ -2801,7 +2482,7 @@
         <w:t xml:space="preserve">• </w:t>
       </w:r>
       <w:r>
-        <w:t>При дивидендах или продаже компании в расчёте участвует только закрепившаяся часть, если иное прямо не установлено утверждёнными правилами.</w:t>
+        <w:t>Полная стоимость, закрепившаяся стоимость и фактическая выплата — разные величины. При дивидендах, продаже компании или другом утверждённом событии в расчёте участвует закрепившаяся часть, если правила программы прямо не предусматривают иное.</w:t>
       </w:r>
     </w:p>
     <w:p>
@@ -2817,7 +2498,7 @@
         <w:t xml:space="preserve">• </w:t>
       </w:r>
       <w:r>
-        <w:t>При добросовестном уходе закрепившаяся часть сохраняется, незакрепившаяся возвращается в свободный остаток программы.</w:t>
+        <w:t>При добросовестном уходе закрепившаяся часть сохраняется, а незакрепившаяся возвращается в свободный остаток программы.</w:t>
       </w:r>
     </w:p>
     <w:p>
@@ -2833,7 +2514,7 @@
         <w:t xml:space="preserve">• </w:t>
       </w:r>
       <w:r>
-        <w:t>Последствия серьёзного нарушения должны быть заранее и узко определены в утверждённых документах, а не решаться задним числом.</w:t>
+        <w:t>Последствия серьёзного нарушения должны быть заранее и узко определены утверждёнными документами программы, а не решаться задним числом.</w:t>
       </w:r>
     </w:p>
     <w:p>
@@ -2849,7 +2530,7 @@
         <w:t xml:space="preserve">• </w:t>
       </w:r>
       <w:r>
-        <w:t>Критичный найм в середине года возможен только отдельным решением Совета директоров из его 1 млн резервных единиц.</w:t>
+        <w:t>Критичный найм в середине года возможен только по отдельному решению СД из его резерва 1 млн единиц.</w:t>
       </w:r>
     </w:p>
     <w:p>
@@ -2857,6 +2538,9 @@
         <w:pStyle w:val="Heading1"/>
       </w:pPr>
       <w:r>
+        <w:rPr>
+          <w:i w:val="0"/>
+        </w:rPr>
         <w:t>Основные риски расчётной стоимости</w:t>
       </w:r>
     </w:p>
@@ -2873,7 +2557,7 @@
         <w:t xml:space="preserve">• </w:t>
       </w:r>
       <w:r>
-        <w:t>Фактическая оценка компании может оказаться ниже сценарной.</w:t>
+        <w:t>16 млрд ₽ и 8 млрд ₽ — сценарные, а не гарантированные оценки. Фактическая стоимость компании и пакетов может быть ниже.</w:t>
       </w:r>
     </w:p>
     <w:p>
@@ -2889,7 +2573,7 @@
         <w:t xml:space="preserve">• </w:t>
       </w:r>
       <w:r>
-        <w:t>Инвестиционные раунды уменьшают процентную долю всех прежних единиц.</w:t>
+        <w:t>Инвестиционные раунды увеличивают число единиц и уменьшают долю каждой ранее существовавшей единицы.</w:t>
       </w:r>
     </w:p>
     <w:p>
@@ -2905,7 +2589,7 @@
         <w:t xml:space="preserve">• </w:t>
       </w:r>
       <w:r>
-        <w:t>Продажа компании, дивиденды или другое событие выплаты не гарантированы.</w:t>
+        <w:t>Продажа компании, дивиденды или другое событие выплаты не гарантированы и не привязаны к пятому году программы.</w:t>
       </w:r>
     </w:p>
     <w:p>
@@ -2937,12 +2621,7 @@
         <w:t xml:space="preserve">• </w:t>
       </w:r>
       <w:r>
-        <w:t>Расчётная полная стоимость не равна закрепившейся части и не равна сумме после налогов.</w:t>
-      </w:r>
-    </w:p>
-    <w:p>
-      <w:r>
-        <w:br w:type="page"/>
+        <w:t>Расчётная полная стоимость не равна закрепившейся части и не равна сумме к выплате после налогов.</w:t>
       </w:r>
     </w:p>
     <w:p>
@@ -2950,277 +2629,9 @@
         <w:pStyle w:val="Heading1"/>
       </w:pPr>
       <w:r>
-        <w:t>Приложение 1. История экранов для команды</w:t>
-      </w:r>
-    </w:p>
-    <w:p>
-      <w:pPr>
-        <w:pStyle w:val="Heading2"/>
-      </w:pPr>
-      <w:r>
-        <w:t>1. Мы растим стоимость — и разделяем результат</w:t>
-      </w:r>
-    </w:p>
-    <w:p>
-      <w:pPr>
-        <w:widowControl/>
-      </w:pPr>
-      <w:r>
         <w:rPr>
           <w:i w:val="0"/>
         </w:rPr>
-        <w:t>Ваш вклад в долгий рост компании может стать значительным личным финансовым результатом.</w:t>
-      </w:r>
-    </w:p>
-    <w:p>
-      <w:pPr>
-        <w:pStyle w:val="Heading2"/>
-      </w:pPr>
-      <w:r>
-        <w:t>2. В начале года вы заранее знаете, за какой пакет работаете</w:t>
-      </w:r>
-    </w:p>
-    <w:p>
-      <w:pPr>
-        <w:widowControl/>
-      </w:pPr>
-      <w:r>
-        <w:rPr>
-          <w:i w:val="0"/>
-        </w:rPr>
-        <w:t>До начала цикла СД фиксирует участие, размер пакета, цену и целевое число единиц. Рост стоимости в течение года работает в пользу сотрудника.</w:t>
-      </w:r>
-    </w:p>
-    <w:p>
-      <w:pPr>
-        <w:pStyle w:val="Heading2"/>
-      </w:pPr>
-      <w:r>
-        <w:t>3. Новый пакет нужно заново заслужить — автоматического продления нет</w:t>
-      </w:r>
-    </w:p>
-    <w:p>
-      <w:pPr>
-        <w:widowControl/>
-      </w:pPr>
-      <w:r>
-        <w:rPr>
-          <w:i w:val="0"/>
-        </w:rPr>
-        <w:t>Результат текущего года подтверждает текущий пакет и влияет на новое решение. Следующий пакет может быть больше, меньше или равен нулю.</w:t>
-      </w:r>
-    </w:p>
-    <w:p>
-      <w:pPr>
-        <w:pStyle w:val="Heading2"/>
-      </w:pPr>
-      <w:r>
-        <w:t>4. Каждый заработанный пакет закрепляется отдельно за 36 месяцев</w:t>
-      </w:r>
-    </w:p>
-    <w:p>
-      <w:pPr>
-        <w:widowControl/>
-      </w:pPr>
-      <w:r>
-        <w:rPr>
-          <w:i w:val="0"/>
-        </w:rPr>
-        <w:t>По 1/12 за полный квартал. Чтобы полностью закрепить уже заработанное, нужно оставаться в компании.</w:t>
-      </w:r>
-    </w:p>
-    <w:p>
-      <w:pPr>
-        <w:pStyle w:val="Heading2"/>
-      </w:pPr>
-      <w:r>
-        <w:t>5. Пакеты разных лет складываются в один результат к шестому году</w:t>
-      </w:r>
-    </w:p>
-    <w:p>
-      <w:pPr>
-        <w:widowControl/>
-      </w:pPr>
-      <w:r>
-        <w:t>Калькулятор показывает число получателей, расход 9% планового лимита, медианную полную стоимость и общую стоимость всех пакетов.</w:t>
-      </w:r>
-    </w:p>
-    <w:p>
-      <w:pPr>
-        <w:pStyle w:val="Heading2"/>
-      </w:pPr>
-      <w:r>
-        <w:t>6. Чтобы единицы стали деньгами, нужны рост и событие выплаты</w:t>
-      </w:r>
-    </w:p>
-    <w:p>
-      <w:pPr>
-        <w:widowControl/>
-      </w:pPr>
-      <w:r>
-        <w:rPr>
-          <w:i w:val="0"/>
-        </w:rPr>
-        <w:t>Оценка и размытие меняют стоимость; фактические деньги появляются только при дивидендах, продаже или другом утверждённом событии.</w:t>
-      </w:r>
-    </w:p>
-    <w:p>
-      <w:pPr>
-        <w:pStyle w:val="Heading2"/>
-      </w:pPr>
-      <w:r>
-        <w:t>7. Если ситуация меняется, заранее известно, что сохраняется</w:t>
-      </w:r>
-    </w:p>
-    <w:p>
-      <w:pPr>
-        <w:widowControl/>
-      </w:pPr>
-      <w:r>
-        <w:rPr>
-          <w:i w:val="0"/>
-        </w:rPr>
-        <w:t>Правила ухода, серьёзного нарушения, критичного найма и продажи компании определяются до события.</w:t>
-      </w:r>
-    </w:p>
-    <w:p>
-      <w:r>
-        <w:br w:type="page"/>
-      </w:r>
-    </w:p>
-    <w:p>
-      <w:pPr>
-        <w:pStyle w:val="Heading1"/>
-      </w:pPr>
-      <w:r>
-        <w:t>Приложение 2. История экранов для инвесторов</w:t>
-      </w:r>
-    </w:p>
-    <w:p>
-      <w:pPr>
-        <w:pStyle w:val="Heading2"/>
-      </w:pPr>
-      <w:r>
-        <w:t>1. Привлекать сильных. Удерживать лучших. Не выходить за 10%.</w:t>
-      </w:r>
-    </w:p>
-    <w:p>
-      <w:pPr>
-        <w:widowControl/>
-      </w:pPr>
-      <w:r>
-        <w:rPr>
-          <w:i w:val="0"/>
-        </w:rPr>
-        <w:t>Программа создаёт общий экономический интерес у критичных создателей стоимости и заранее ограничивает максимальное размытие.</w:t>
-      </w:r>
-    </w:p>
-    <w:p>
-      <w:pPr>
-        <w:pStyle w:val="Heading2"/>
-      </w:pPr>
-      <w:r>
-        <w:t>2. Пакет согласуется до начала года — результат подтверждается после</w:t>
-      </w:r>
-    </w:p>
-    <w:p>
-      <w:pPr>
-        <w:widowControl/>
-      </w:pPr>
-      <w:r>
-        <w:rPr>
-          <w:i w:val="0"/>
-        </w:rPr>
-        <w:t>СД проверяет лимит, утверждает множитель, цену и целевое число единиц; сотрудник создаёт стоимость; после года СД подтверждает результат; права закрепляются 36 месяцев; следующий пакет утверждается заново.</w:t>
-      </w:r>
-    </w:p>
-    <w:p>
-      <w:pPr>
-        <w:pStyle w:val="Heading2"/>
-      </w:pPr>
-      <w:r>
-        <w:t>3. Пакеты получают создатели стоимости, а не клуб приближённых</w:t>
-      </w:r>
-    </w:p>
-    <w:p>
-      <w:pPr>
-        <w:widowControl/>
-      </w:pPr>
-      <w:r>
-        <w:rPr>
-          <w:i w:val="0"/>
-        </w:rPr>
-        <w:t>До 20 участников охватывают покупки и интеграцию компаний, продукт и искусственный интеллект, 1С, операции, удержание и развитие клиентской базы, самостоятельные направления прибыли. Ежегодный переотбор и пересекающиеся сроки закрепления создают постоянное удержание без автоматической раздачи.</w:t>
-      </w:r>
-    </w:p>
-    <w:p>
-      <w:pPr>
-        <w:pStyle w:val="Heading2"/>
-      </w:pPr>
-      <w:r>
-        <w:t>4. 9% — плановые выдачи. 1% — резерв СД. Больше 10% не выдаём.</w:t>
-      </w:r>
-    </w:p>
-    <w:p>
-      <w:pPr>
-        <w:widowControl/>
-      </w:pPr>
-      <w:r>
-        <w:rPr>
-          <w:i w:val="0"/>
-        </w:rPr>
-        <w:t>4 / 2 / 2 / 1 млн исходных единиц идут на плановые пакеты. 1 млн остаётся на будущие критичные назначения. Раунды не восстанавливают процент лимита.</w:t>
-      </w:r>
-    </w:p>
-    <w:tbl>
-      <w:tblPr>
-        <w:tblW w:type="auto" w:w="0"/>
-        <w:jc w:val="center"/>
-        <w:tblLayout w:type="autofit"/>
-        <w:tblLook w:firstColumn="1" w:firstRow="1" w:lastColumn="0" w:lastRow="0" w:noHBand="0" w:noVBand="1" w:val="04A0"/>
-      </w:tblPr>
-      <w:tblGrid>
-        <w:gridCol w:w="9866"/>
-      </w:tblGrid>
-      <w:tr>
-        <w:tc>
-          <w:tcPr>
-            <w:tcW w:type="dxa" w:w="9866"/>
-            <w:shd w:fill="E2F0D9"/>
-            <w:tcMar>
-              <w:top w:w="130" w:type="dxa"/>
-              <w:start w:w="160" w:type="dxa"/>
-              <w:bottom w:w="130" w:type="dxa"/>
-              <w:end w:w="160" w:type="dxa"/>
-            </w:tcMar>
-            <w:vAlign w:val="center"/>
-          </w:tcPr>
-          <w:p>
-            <w:r>
-              <w:rPr>
-                <w:b/>
-                <w:color w:val="17365D"/>
-              </w:rPr>
-              <w:t>Центральный экран для инвестора</w:t>
-            </w:r>
-            <w:r>
-              <w:br/>
-              <w:t>Второй экран должен быть не лозунгом, а простой схемой: начало года → фиксируем пакет и число единиц → год работы → подтверждаем результат → 36 месяцев закрепления → новое решение.</w:t>
-            </w:r>
-          </w:p>
-        </w:tc>
-      </w:tr>
-    </w:tbl>
-    <w:p>
-      <w:pPr>
-        <w:spacing w:after="0"/>
-      </w:pPr>
-    </w:p>
-    <w:p>
-      <w:pPr>
-        <w:pStyle w:val="Heading1"/>
-      </w:pPr>
-      <w:r>
         <w:t>Статус документа</w:t>
       </w:r>
     </w:p>
@@ -3233,7 +2644,7 @@
           <w:i/>
           <w:color w:val="7F7F7F"/>
         </w:rPr>
-        <w:t>Документ описывает рекомендуемую экономическую и коммуникационную конструкцию. Фактические права возникают только после утверждения окончательных корпоративных, юридических, налоговых и индивидуальных документов программы; при расхождении применяются утверждённые документы.</w:t>
+        <w:t>Это информационное описание. Фактические права и обязанности определяются утверждёнными документами программы; при расхождении применяются они.</w:t>
       </w:r>
     </w:p>
     <w:sectPr>
@@ -3258,16 +2669,49 @@
       <w:rPr>
         <w:rFonts w:ascii="Arial" w:hAnsi="Arial"/>
         <w:color w:val="7F7F7F"/>
-        <w:sz w:val="16"/>
+        <w:sz w:val="18"/>
       </w:rPr>
-      <w:t>Рабочая концепция • июль 2026</w:t>
+      <w:t xml:space="preserve">Информационное описание • июль 2026    </w:t>
     </w:r>
     <w:r>
-      <w:t xml:space="preserve">    </w:t>
+      <w:rPr>
+        <w:rFonts w:ascii="Arial" w:hAnsi="Arial"/>
+        <w:color w:val="7F7F7F"/>
+        <w:sz w:val="18"/>
+      </w:rPr>
+      <w:fldChar w:fldCharType="begin"/>
     </w:r>
     <w:r>
-      <w:fldChar w:fldCharType="begin"/>
+      <w:rPr>
+        <w:rFonts w:ascii="Arial" w:hAnsi="Arial"/>
+        <w:color w:val="7F7F7F"/>
+        <w:sz w:val="18"/>
+      </w:rPr>
       <w:instrText xml:space="preserve"> PAGE </w:instrText>
+    </w:r>
+    <w:r>
+      <w:rPr>
+        <w:rFonts w:ascii="Arial" w:hAnsi="Arial"/>
+        <w:color w:val="7F7F7F"/>
+        <w:sz w:val="18"/>
+      </w:rPr>
+      <w:fldChar w:fldCharType="separate"/>
+    </w:r>
+    <w:r>
+      <w:rPr>
+        <w:rFonts w:ascii="Arial" w:hAnsi="Arial"/>
+        <w:i/>
+        <w:color w:val="7F7F7F"/>
+        <w:sz w:val="18"/>
+      </w:rPr>
+      <w:t>1</w:t>
+    </w:r>
+    <w:r>
+      <w:rPr>
+        <w:rFonts w:ascii="Arial" w:hAnsi="Arial"/>
+        <w:color w:val="7F7F7F"/>
+        <w:sz w:val="18"/>
+      </w:rPr>
       <w:fldChar w:fldCharType="end"/>
     </w:r>
   </w:p>

</xml_diff>

<commit_message>
Publish final LTI communication flow
</commit_message>
<xml_diff>
--- a/lti/downloads/Aivel_LTI_programme_description.docx
+++ b/lti/downloads/Aivel_LTI_programme_description.docx
@@ -163,7 +163,7 @@
         <w:t>Следующий пакет не возникает автоматически.</w:t>
       </w:r>
       <w:r>
-        <w:t xml:space="preserve"> В начале каждого нового года СД заново утверждает участника и размер пакета. Прошлогоднее участие не гарантирует новый пакет или прежний размер.</w:t>
+        <w:t xml:space="preserve"> В начале каждого нового года СД заново утверждает участника и размер пакета. Для всех ролей применяются одинаковые критерии: влияние на долгосрочную стоимость, критичная ответственность, измеримый результат и ценность удержания. Прошлогоднее участие не гарантирует новый пакет или прежний размер.</w:t>
       </w:r>
     </w:p>
     <w:p>
@@ -216,20 +216,7 @@
         <w:widowControl/>
       </w:pPr>
       <w:r>
-        <w:rPr>
-          <w:b/>
-          <w:color w:val="2F5597"/>
-        </w:rPr>
-        <w:t xml:space="preserve">7. </w:t>
-      </w:r>
-      <w:r>
-        <w:rPr>
-          <w:b/>
-        </w:rPr>
-        <w:t>Плановые выдачи составляют 9%, резерв СД — 1%.</w:t>
-      </w:r>
-      <w:r>
-        <w:t xml:space="preserve"> Годовые пределы плановых пакетов — 4 / 2 / 1 / 1 / 1 млн исходных единиц в Г1–Г5. Ещё 1 млн единиц выдаётся только отдельным решением СД на будущие критичные назначения.</w:t>
+        <w:t>7. Плановые выдачи составляют 9%, резерв СД — 1%. По годам распределяется не более 4% / 2% / 1% / 1% / 1% исходной базы в Г1–Г5 — это 4 / 2 / 1 / 1 / 1 млн исходных единиц. Ещё 1% (1 млн единиц) выдаётся только отдельным решением СД на будущие критичные назначения.</w:t>
       </w:r>
     </w:p>
     <w:p>
@@ -1069,12 +1056,83 @@
           </w:tcPr>
           <w:p>
             <w:r>
+              <w:t>4% / 4 000 000 ед.</w:t>
+            </w:r>
+          </w:p>
+        </w:tc>
+        <w:tc>
+          <w:tcPr>
+            <w:tcW w:type="dxa" w:w="2324"/>
+            <w:tcMar>
+              <w:top w:w="80" w:type="dxa"/>
+              <w:start w:w="100" w:type="dxa"/>
+              <w:bottom w:w="80" w:type="dxa"/>
+              <w:end w:w="100" w:type="dxa"/>
+            </w:tcMar>
+          </w:tcPr>
+          <w:p>
+            <w:r>
               <w:t>4 000 000 ед.</w:t>
             </w:r>
           </w:p>
         </w:tc>
         <w:tc>
           <w:tcPr>
+            <w:tcW w:type="dxa" w:w="3685"/>
+            <w:tcMar>
+              <w:top w:w="80" w:type="dxa"/>
+              <w:start w:w="100" w:type="dxa"/>
+              <w:bottom w:w="80" w:type="dxa"/>
+              <w:end w:w="100" w:type="dxa"/>
+            </w:tcMar>
+          </w:tcPr>
+          <w:p>
+            <w:r>
+              <w:t>Плановые пакеты</w:t>
+            </w:r>
+          </w:p>
+        </w:tc>
+      </w:tr>
+      <w:tr>
+        <w:trPr>
+          <w:cantSplit/>
+        </w:trPr>
+        <w:tc>
+          <w:tcPr>
+            <w:tcW w:type="dxa" w:w="1701"/>
+            <w:tcMar>
+              <w:top w:w="80" w:type="dxa"/>
+              <w:start w:w="100" w:type="dxa"/>
+              <w:bottom w:w="80" w:type="dxa"/>
+              <w:end w:w="100" w:type="dxa"/>
+            </w:tcMar>
+            <w:shd w:fill="EAF2F8"/>
+          </w:tcPr>
+          <w:p>
+            <w:r>
+              <w:t>Г2 / 2028</w:t>
+            </w:r>
+          </w:p>
+        </w:tc>
+        <w:tc>
+          <w:tcPr>
+            <w:tcW w:type="dxa" w:w="1871"/>
+            <w:tcMar>
+              <w:top w:w="80" w:type="dxa"/>
+              <w:start w:w="100" w:type="dxa"/>
+              <w:bottom w:w="80" w:type="dxa"/>
+              <w:end w:w="100" w:type="dxa"/>
+            </w:tcMar>
+            <w:shd w:fill="EAF2F8"/>
+          </w:tcPr>
+          <w:p>
+            <w:r>
+              <w:t>2% / 2 000 000 ед.</w:t>
+            </w:r>
+          </w:p>
+        </w:tc>
+        <w:tc>
+          <w:tcPr>
             <w:tcW w:type="dxa" w:w="2324"/>
             <w:tcMar>
               <w:top w:w="80" w:type="dxa"/>
@@ -1082,10 +1140,11 @@
               <w:bottom w:w="80" w:type="dxa"/>
               <w:end w:w="100" w:type="dxa"/>
             </w:tcMar>
-          </w:tcPr>
-          <w:p>
-            <w:r>
-              <w:t>4 000 000 ед.</w:t>
+            <w:shd w:fill="EAF2F8"/>
+          </w:tcPr>
+          <w:p>
+            <w:r>
+              <w:t>6 000 000 ед.</w:t>
             </w:r>
           </w:p>
         </w:tc>
@@ -1098,6 +1157,7 @@
               <w:bottom w:w="80" w:type="dxa"/>
               <w:end w:w="100" w:type="dxa"/>
             </w:tcMar>
+            <w:shd w:fill="EAF2F8"/>
           </w:tcPr>
           <w:p>
             <w:r>
@@ -1119,11 +1179,10 @@
               <w:bottom w:w="80" w:type="dxa"/>
               <w:end w:w="100" w:type="dxa"/>
             </w:tcMar>
-            <w:shd w:fill="EAF2F8"/>
-          </w:tcPr>
-          <w:p>
-            <w:r>
-              <w:t>Г2 / 2028</w:t>
+          </w:tcPr>
+          <w:p>
+            <w:r>
+              <w:t>Г3 / 2029</w:t>
             </w:r>
           </w:p>
         </w:tc>
@@ -1136,11 +1195,10 @@
               <w:bottom w:w="80" w:type="dxa"/>
               <w:end w:w="100" w:type="dxa"/>
             </w:tcMar>
-            <w:shd w:fill="EAF2F8"/>
-          </w:tcPr>
-          <w:p>
-            <w:r>
-              <w:t>2 000 000 ед.</w:t>
+          </w:tcPr>
+          <w:p>
+            <w:r>
+              <w:t>1% / 1 000 000 ед.</w:t>
             </w:r>
           </w:p>
         </w:tc>
@@ -1153,11 +1211,10 @@
               <w:bottom w:w="80" w:type="dxa"/>
               <w:end w:w="100" w:type="dxa"/>
             </w:tcMar>
-            <w:shd w:fill="EAF2F8"/>
-          </w:tcPr>
-          <w:p>
-            <w:r>
-              <w:t>6 000 000 ед.</w:t>
+          </w:tcPr>
+          <w:p>
+            <w:r>
+              <w:t>7 000 000 ед.</w:t>
             </w:r>
           </w:p>
         </w:tc>
@@ -1170,7 +1227,6 @@
               <w:bottom w:w="80" w:type="dxa"/>
               <w:end w:w="100" w:type="dxa"/>
             </w:tcMar>
-            <w:shd w:fill="EAF2F8"/>
           </w:tcPr>
           <w:p>
             <w:r>
@@ -1192,10 +1248,11 @@
               <w:bottom w:w="80" w:type="dxa"/>
               <w:end w:w="100" w:type="dxa"/>
             </w:tcMar>
-          </w:tcPr>
-          <w:p>
-            <w:r>
-              <w:t>Г3 / 2029</w:t>
+            <w:shd w:fill="EAF2F8"/>
+          </w:tcPr>
+          <w:p>
+            <w:r>
+              <w:t>Г4 / 2030</w:t>
             </w:r>
           </w:p>
         </w:tc>
@@ -1208,10 +1265,11 @@
               <w:bottom w:w="80" w:type="dxa"/>
               <w:end w:w="100" w:type="dxa"/>
             </w:tcMar>
-          </w:tcPr>
-          <w:p>
-            <w:r>
-              <w:t>1 000 000 ед.</w:t>
+            <w:shd w:fill="EAF2F8"/>
+          </w:tcPr>
+          <w:p>
+            <w:r>
+              <w:t>1% / 1 000 000 ед.</w:t>
             </w:r>
           </w:p>
         </w:tc>
@@ -1224,10 +1282,11 @@
               <w:bottom w:w="80" w:type="dxa"/>
               <w:end w:w="100" w:type="dxa"/>
             </w:tcMar>
-          </w:tcPr>
-          <w:p>
-            <w:r>
-              <w:t>7 000 000 ед.</w:t>
+            <w:shd w:fill="EAF2F8"/>
+          </w:tcPr>
+          <w:p>
+            <w:r>
+              <w:t>8 000 000 ед.</w:t>
             </w:r>
           </w:p>
         </w:tc>
@@ -1240,6 +1299,7 @@
               <w:bottom w:w="80" w:type="dxa"/>
               <w:end w:w="100" w:type="dxa"/>
             </w:tcMar>
+            <w:shd w:fill="EAF2F8"/>
           </w:tcPr>
           <w:p>
             <w:r>
@@ -1261,11 +1321,10 @@
               <w:bottom w:w="80" w:type="dxa"/>
               <w:end w:w="100" w:type="dxa"/>
             </w:tcMar>
-            <w:shd w:fill="EAF2F8"/>
-          </w:tcPr>
-          <w:p>
-            <w:r>
-              <w:t>Г4 / 2030</w:t>
+          </w:tcPr>
+          <w:p>
+            <w:r>
+              <w:t>Г5 / 2031</w:t>
             </w:r>
           </w:p>
         </w:tc>
@@ -1278,11 +1337,10 @@
               <w:bottom w:w="80" w:type="dxa"/>
               <w:end w:w="100" w:type="dxa"/>
             </w:tcMar>
-            <w:shd w:fill="EAF2F8"/>
-          </w:tcPr>
-          <w:p>
-            <w:r>
-              <w:t>1 000 000 ед.</w:t>
+          </w:tcPr>
+          <w:p>
+            <w:r>
+              <w:t>1% / 1 000 000 ед.</w:t>
             </w:r>
           </w:p>
         </w:tc>
@@ -1295,11 +1353,10 @@
               <w:bottom w:w="80" w:type="dxa"/>
               <w:end w:w="100" w:type="dxa"/>
             </w:tcMar>
-            <w:shd w:fill="EAF2F8"/>
-          </w:tcPr>
-          <w:p>
-            <w:r>
-              <w:t>8 000 000 ед.</w:t>
+          </w:tcPr>
+          <w:p>
+            <w:r>
+              <w:t>9 000 000 ед.</w:t>
             </w:r>
           </w:p>
         </w:tc>
@@ -1312,7 +1369,6 @@
               <w:bottom w:w="80" w:type="dxa"/>
               <w:end w:w="100" w:type="dxa"/>
             </w:tcMar>
-            <w:shd w:fill="EAF2F8"/>
           </w:tcPr>
           <w:p>
             <w:r>
@@ -1334,10 +1390,11 @@
               <w:bottom w:w="80" w:type="dxa"/>
               <w:end w:w="100" w:type="dxa"/>
             </w:tcMar>
-          </w:tcPr>
-          <w:p>
-            <w:r>
-              <w:t>Г5 / 2031</w:t>
+            <w:shd w:fill="EAF2F8"/>
+          </w:tcPr>
+          <w:p>
+            <w:r>
+              <w:t>Резерв СД</w:t>
             </w:r>
           </w:p>
         </w:tc>
@@ -1350,81 +1407,11 @@
               <w:bottom w:w="80" w:type="dxa"/>
               <w:end w:w="100" w:type="dxa"/>
             </w:tcMar>
-          </w:tcPr>
-          <w:p>
-            <w:r>
-              <w:t>1 000 000 ед.</w:t>
-            </w:r>
-          </w:p>
-        </w:tc>
-        <w:tc>
-          <w:tcPr>
-            <w:tcW w:type="dxa" w:w="2324"/>
-            <w:tcMar>
-              <w:top w:w="80" w:type="dxa"/>
-              <w:start w:w="100" w:type="dxa"/>
-              <w:bottom w:w="80" w:type="dxa"/>
-              <w:end w:w="100" w:type="dxa"/>
-            </w:tcMar>
-          </w:tcPr>
-          <w:p>
-            <w:r>
-              <w:t>9 000 000 ед.</w:t>
-            </w:r>
-          </w:p>
-        </w:tc>
-        <w:tc>
-          <w:tcPr>
-            <w:tcW w:type="dxa" w:w="3685"/>
-            <w:tcMar>
-              <w:top w:w="80" w:type="dxa"/>
-              <w:start w:w="100" w:type="dxa"/>
-              <w:bottom w:w="80" w:type="dxa"/>
-              <w:end w:w="100" w:type="dxa"/>
-            </w:tcMar>
-          </w:tcPr>
-          <w:p>
-            <w:r>
-              <w:t>Плановые пакеты</w:t>
-            </w:r>
-          </w:p>
-        </w:tc>
-      </w:tr>
-      <w:tr>
-        <w:trPr>
-          <w:cantSplit/>
-        </w:trPr>
-        <w:tc>
-          <w:tcPr>
-            <w:tcW w:type="dxa" w:w="1701"/>
-            <w:tcMar>
-              <w:top w:w="80" w:type="dxa"/>
-              <w:start w:w="100" w:type="dxa"/>
-              <w:bottom w:w="80" w:type="dxa"/>
-              <w:end w:w="100" w:type="dxa"/>
-            </w:tcMar>
-            <w:shd w:fill="EAF2F8"/>
-          </w:tcPr>
-          <w:p>
-            <w:r>
-              <w:t>Резерв СД</w:t>
-            </w:r>
-          </w:p>
-        </w:tc>
-        <w:tc>
-          <w:tcPr>
-            <w:tcW w:type="dxa" w:w="1871"/>
-            <w:tcMar>
-              <w:top w:w="80" w:type="dxa"/>
-              <w:start w:w="100" w:type="dxa"/>
-              <w:bottom w:w="80" w:type="dxa"/>
-              <w:end w:w="100" w:type="dxa"/>
-            </w:tcMar>
-            <w:shd w:fill="EAF2F8"/>
-          </w:tcPr>
-          <w:p>
-            <w:r>
-              <w:t>1 000 000 ед.</w:t>
+            <w:shd w:fill="EAF2F8"/>
+          </w:tcPr>
+          <w:p>
+            <w:r>
+              <w:t>1% / 1 000 000 ед.</w:t>
             </w:r>
           </w:p>
         </w:tc>
@@ -1514,7 +1501,23 @@
         <w:t xml:space="preserve">• </w:t>
       </w:r>
       <w:r>
-        <w:t>Не более 20 человек могут одновременно участвовать в программе. Число участников не меняет общий предел: его определяет число единиц.</w:t>
+        <w:t>Перед каждым решением СД видит годовой лимит, число участников, выбранные размеры пакетов, уже выданные гранты и эффект инвестиционного размытия. Число участников не меняет общий предел: его определяет число единиц.</w:t>
+      </w:r>
+    </w:p>
+    <w:p>
+      <w:pPr>
+        <w:ind w:left="255" w:hanging="142"/>
+        <w:widowControl/>
+      </w:pPr>
+      <w:r>
+        <w:rPr>
+          <w:b/>
+          <w:color w:val="2F5597"/>
+        </w:rPr>
+        <w:t xml:space="preserve">• </w:t>
+      </w:r>
+      <w:r>
+        <w:t>Стоимость создаётся в нескольких контурах: приобретения и интеграция, продукт и ИИ, 1С, операции, коммерческий рост и удержание клиентов. Поэтому СД может включить в программу до 20 критичных ролей, не меняя общий предел — 10% исходной базы.</w:t>
       </w:r>
     </w:p>
     <w:p>
@@ -1921,7 +1924,7 @@
         <w:rPr>
           <w:i w:val="0"/>
         </w:rPr>
-        <w:t>На 01.01.2027 в расчётной модели используется индикативная стоимость капитала 1,6 млрд ₽ и цена 16 ₽ за единицу. Для каждого следующего цикла цена фиксируется в начале года исходя из утверждённой оценки и полностью разводнённой базы на эту дату. В течение года цена и целевое число единиц не пересчитываются. Новые единицы инвесторов размывают все существующие единицы одинаково.</w:t>
+        <w:t>На 01.01.2027 в расчётной модели используется индикативная стоимость капитала 1,6 млрд ₽ и цена 16 ₽ за единицу. Для каждого следующего цикла цена фиксируется в начале года исходя из утверждённой оценки и полностью разводнённой базы на эту дату. В течение года цена и целевое число единиц не пересчитываются. При более низкой цене тот же пакет требует больше единиц, поэтому в годовой лимит может поместиться меньше людей: СД регулирует состав и размеры новых пакетов, а не расширяет предел. Новые единицы инвесторов размывают все существующие единицы одинаково.</w:t>
       </w:r>
     </w:p>
     <w:p>
@@ -2423,12 +2426,528 @@
           <w:i/>
           <w:color w:val="7F7F7F"/>
         </w:rPr>
-        <w:t>По расчётной модели полная стоимость всех плановых пакетов составляет около 1,0 млрд ₽ в базовом и 407,4 млн ₽ в осторожном сценарии. Полная стоимость предполагает, что все заработанные единицы полностью закрепились. Закрепившаяся стоимость — только часть, срок которой уже прошёл. Выплата возникает лишь при отдельном событии выплаты и не привязана к окончанию Г5.</w:t>
+        <w:t>Полная стоимость всего планового объёма 9 млн исходных единиц составляет около 1,034 млрд ₽ в базовом и 408,7 млн ₽ в осторожном сценарии. Расчётная модель фактически распределяет 8,9769 и 8,9709 млн единиц стоимостью 1 031,6 и 407,4 млн ₽ соответственно. Это полная стоимость после закрепления всех пакетов, а не выплата в конце Г5.</w:t>
       </w:r>
     </w:p>
     <w:p>
       <w:pPr>
         <w:pStyle w:val="Heading1"/>
+      </w:pPr>
+      <w:r>
+        <w:t>Синтетический пятилетний пример, близкий к медиане</w:t>
+      </w:r>
+    </w:p>
+    <w:p>
+      <w:pPr/>
+      <w:r>
+        <w:t>Это условная иллюстрация накопления, а не фактическая траектория медианного участника, не данные реального сотрудника и не индивидуальное обещание. Значение 33,9 млн ₽ — статистическая медиана модели. Чтобы наглядно показать близкий результат, в примере взяты 450 тыс. ₽ до вычета налогов в месяц, полная годовая стоимость с налогами и взносами 6,21 млн ₽, выполнение обоих КПЭ на 100% и пакеты 0,25 / 0,50 / 0,75 / 0,75 / 0,75 годовой стоимости.</w:t>
+      </w:r>
+    </w:p>
+    <w:tbl>
+      <w:tblPr>
+        <w:tblW w:type="auto" w:w="0"/>
+        <w:jc w:val="center"/>
+        <w:tblLayout w:type="fixed"/>
+        <w:tblLook w:firstColumn="1" w:firstRow="1" w:lastColumn="0" w:lastRow="0" w:noHBand="0" w:noVBand="1" w:val="04A0"/>
+        <w:tblBorders>
+          <w:top w:val="single" w:sz="4" w:space="0" w:color="B4C6E7"/>
+          <w:left w:val="single" w:sz="4" w:space="0" w:color="B4C6E7"/>
+          <w:bottom w:val="single" w:sz="4" w:space="0" w:color="B4C6E7"/>
+          <w:right w:val="single" w:sz="4" w:space="0" w:color="B4C6E7"/>
+          <w:insideH w:val="single" w:sz="4" w:space="0" w:color="B4C6E7"/>
+          <w:insideV w:val="single" w:sz="4" w:space="0" w:color="B4C6E7"/>
+        </w:tblBorders>
+      </w:tblPr>
+      <w:tblGrid>
+        <w:gridCol w:w="2466"/>
+        <w:gridCol w:w="2466"/>
+        <w:gridCol w:w="2466"/>
+        <w:gridCol w:w="2466"/>
+      </w:tblGrid>
+      <w:tr>
+        <w:trPr>
+          <w:tblHeader w:val="true"/>
+          <w:cantSplit/>
+        </w:trPr>
+        <w:tc>
+          <w:tcPr>
+            <w:tcW w:type="dxa" w:w="1701"/>
+            <w:shd w:fill="17365D"/>
+            <w:tcMar>
+              <w:top w:w="80" w:type="dxa"/>
+              <w:start w:w="100" w:type="dxa"/>
+              <w:bottom w:w="80" w:type="dxa"/>
+              <w:end w:w="100" w:type="dxa"/>
+            </w:tcMar>
+          </w:tcPr>
+          <w:p>
+            <w:r>
+              <w:rPr>
+                <w:b/>
+                <w:color w:val="FFFFFF"/>
+              </w:rPr>
+              <w:t>Год</w:t>
+            </w:r>
+          </w:p>
+        </w:tc>
+        <w:tc>
+          <w:tcPr>
+            <w:tcW w:type="dxa" w:w="1871"/>
+            <w:shd w:fill="17365D"/>
+            <w:tcMar>
+              <w:top w:w="80" w:type="dxa"/>
+              <w:start w:w="100" w:type="dxa"/>
+              <w:bottom w:w="80" w:type="dxa"/>
+              <w:end w:w="100" w:type="dxa"/>
+            </w:tcMar>
+          </w:tcPr>
+          <w:p>
+            <w:r>
+              <w:rPr>
+                <w:b/>
+                <w:color w:val="FFFFFF"/>
+              </w:rPr>
+              <w:t>Пакет / цена</w:t>
+            </w:r>
+          </w:p>
+        </w:tc>
+        <w:tc>
+          <w:tcPr>
+            <w:tcW w:type="dxa" w:w="2324"/>
+            <w:shd w:fill="17365D"/>
+            <w:tcMar>
+              <w:top w:w="80" w:type="dxa"/>
+              <w:start w:w="100" w:type="dxa"/>
+              <w:bottom w:w="80" w:type="dxa"/>
+              <w:end w:w="100" w:type="dxa"/>
+            </w:tcMar>
+          </w:tcPr>
+          <w:p>
+            <w:r>
+              <w:rPr>
+                <w:b/>
+                <w:color w:val="FFFFFF"/>
+              </w:rPr>
+              <w:t>Заработано</w:t>
+            </w:r>
+          </w:p>
+        </w:tc>
+        <w:tc>
+          <w:tcPr>
+            <w:tcW w:type="dxa" w:w="3685"/>
+            <w:shd w:fill="17365D"/>
+            <w:tcMar>
+              <w:top w:w="80" w:type="dxa"/>
+              <w:start w:w="100" w:type="dxa"/>
+              <w:bottom w:w="80" w:type="dxa"/>
+              <w:end w:w="100" w:type="dxa"/>
+            </w:tcMar>
+          </w:tcPr>
+          <w:p>
+            <w:r>
+              <w:rPr>
+                <w:b/>
+                <w:color w:val="FFFFFF"/>
+              </w:rPr>
+              <w:t>Стоимость → накоплено</w:t>
+            </w:r>
+          </w:p>
+        </w:tc>
+      </w:tr>
+      <w:tr>
+        <w:trPr>
+          <w:cantSplit/>
+        </w:trPr>
+        <w:tc>
+          <w:tcPr>
+            <w:tcW w:type="dxa" w:w="1701"/>
+            <w:tcMar>
+              <w:top w:w="80" w:type="dxa"/>
+              <w:start w:w="100" w:type="dxa"/>
+              <w:bottom w:w="80" w:type="dxa"/>
+              <w:end w:w="100" w:type="dxa"/>
+            </w:tcMar>
+          </w:tcPr>
+          <w:p>
+            <w:r>
+              <w:t>Г1</w:t>
+            </w:r>
+          </w:p>
+        </w:tc>
+        <w:tc>
+          <w:tcPr>
+            <w:tcW w:type="dxa" w:w="1871"/>
+            <w:tcMar>
+              <w:top w:w="80" w:type="dxa"/>
+              <w:start w:w="100" w:type="dxa"/>
+              <w:bottom w:w="80" w:type="dxa"/>
+              <w:end w:w="100" w:type="dxa"/>
+            </w:tcMar>
+          </w:tcPr>
+          <w:p>
+            <w:r>
+              <w:t>0,25 / 16,00 ₽</w:t>
+            </w:r>
+          </w:p>
+        </w:tc>
+        <w:tc>
+          <w:tcPr>
+            <w:tcW w:type="dxa" w:w="2324"/>
+            <w:tcMar>
+              <w:top w:w="80" w:type="dxa"/>
+              <w:start w:w="100" w:type="dxa"/>
+              <w:bottom w:w="80" w:type="dxa"/>
+              <w:end w:w="100" w:type="dxa"/>
+            </w:tcMar>
+          </w:tcPr>
+          <w:p>
+            <w:r>
+              <w:t>97 031 ед.</w:t>
+            </w:r>
+          </w:p>
+        </w:tc>
+        <w:tc>
+          <w:tcPr>
+            <w:tcW w:type="dxa" w:w="3685"/>
+            <w:tcMar>
+              <w:top w:w="80" w:type="dxa"/>
+              <w:start w:w="100" w:type="dxa"/>
+              <w:bottom w:w="80" w:type="dxa"/>
+              <w:end w:w="100" w:type="dxa"/>
+            </w:tcMar>
+          </w:tcPr>
+          <w:p>
+            <w:r>
+              <w:t>11,15 → 11,15 млн ₽</w:t>
+            </w:r>
+          </w:p>
+        </w:tc>
+      </w:tr>
+      <w:tr>
+        <w:trPr>
+          <w:cantSplit/>
+        </w:trPr>
+        <w:tc>
+          <w:tcPr>
+            <w:tcW w:type="dxa" w:w="1701"/>
+            <w:tcMar>
+              <w:top w:w="80" w:type="dxa"/>
+              <w:start w:w="100" w:type="dxa"/>
+              <w:bottom w:w="80" w:type="dxa"/>
+              <w:end w:w="100" w:type="dxa"/>
+            </w:tcMar>
+            <w:shd w:fill="EAF2F8"/>
+          </w:tcPr>
+          <w:p>
+            <w:r>
+              <w:t>Г2</w:t>
+            </w:r>
+          </w:p>
+        </w:tc>
+        <w:tc>
+          <w:tcPr>
+            <w:tcW w:type="dxa" w:w="1871"/>
+            <w:tcMar>
+              <w:top w:w="80" w:type="dxa"/>
+              <w:start w:w="100" w:type="dxa"/>
+              <w:bottom w:w="80" w:type="dxa"/>
+              <w:end w:w="100" w:type="dxa"/>
+            </w:tcMar>
+            <w:shd w:fill="EAF2F8"/>
+          </w:tcPr>
+          <w:p>
+            <w:r>
+              <w:t>0,50 / 56,00 ₽</w:t>
+            </w:r>
+          </w:p>
+        </w:tc>
+        <w:tc>
+          <w:tcPr>
+            <w:tcW w:type="dxa" w:w="2324"/>
+            <w:tcMar>
+              <w:top w:w="80" w:type="dxa"/>
+              <w:start w:w="100" w:type="dxa"/>
+              <w:bottom w:w="80" w:type="dxa"/>
+              <w:end w:w="100" w:type="dxa"/>
+            </w:tcMar>
+            <w:shd w:fill="EAF2F8"/>
+          </w:tcPr>
+          <w:p>
+            <w:r>
+              <w:t>55 446 ед.</w:t>
+            </w:r>
+          </w:p>
+        </w:tc>
+        <w:tc>
+          <w:tcPr>
+            <w:tcW w:type="dxa" w:w="3685"/>
+            <w:tcMar>
+              <w:top w:w="80" w:type="dxa"/>
+              <w:start w:w="100" w:type="dxa"/>
+              <w:bottom w:w="80" w:type="dxa"/>
+              <w:end w:w="100" w:type="dxa"/>
+            </w:tcMar>
+            <w:shd w:fill="EAF2F8"/>
+          </w:tcPr>
+          <w:p>
+            <w:r>
+              <w:t>6,37 → 17,52 млн ₽</w:t>
+            </w:r>
+          </w:p>
+        </w:tc>
+      </w:tr>
+      <w:tr>
+        <w:trPr>
+          <w:cantSplit/>
+        </w:trPr>
+        <w:tc>
+          <w:tcPr>
+            <w:tcW w:type="dxa" w:w="1701"/>
+            <w:tcMar>
+              <w:top w:w="80" w:type="dxa"/>
+              <w:start w:w="100" w:type="dxa"/>
+              <w:bottom w:w="80" w:type="dxa"/>
+              <w:end w:w="100" w:type="dxa"/>
+            </w:tcMar>
+          </w:tcPr>
+          <w:p>
+            <w:r>
+              <w:t>Г3</w:t>
+            </w:r>
+          </w:p>
+        </w:tc>
+        <w:tc>
+          <w:tcPr>
+            <w:tcW w:type="dxa" w:w="1871"/>
+            <w:tcMar>
+              <w:top w:w="80" w:type="dxa"/>
+              <w:start w:w="100" w:type="dxa"/>
+              <w:bottom w:w="80" w:type="dxa"/>
+              <w:end w:w="100" w:type="dxa"/>
+            </w:tcMar>
+          </w:tcPr>
+          <w:p>
+            <w:r>
+              <w:t>0,75 / 85,87 ₽</w:t>
+            </w:r>
+          </w:p>
+        </w:tc>
+        <w:tc>
+          <w:tcPr>
+            <w:tcW w:type="dxa" w:w="2324"/>
+            <w:tcMar>
+              <w:top w:w="80" w:type="dxa"/>
+              <w:start w:w="100" w:type="dxa"/>
+              <w:bottom w:w="80" w:type="dxa"/>
+              <w:end w:w="100" w:type="dxa"/>
+            </w:tcMar>
+          </w:tcPr>
+          <w:p>
+            <w:r>
+              <w:t>54 241 ед.</w:t>
+            </w:r>
+          </w:p>
+        </w:tc>
+        <w:tc>
+          <w:tcPr>
+            <w:tcW w:type="dxa" w:w="3685"/>
+            <w:tcMar>
+              <w:top w:w="80" w:type="dxa"/>
+              <w:start w:w="100" w:type="dxa"/>
+              <w:bottom w:w="80" w:type="dxa"/>
+              <w:end w:w="100" w:type="dxa"/>
+            </w:tcMar>
+          </w:tcPr>
+          <w:p>
+            <w:r>
+              <w:t>6,23 → 23,75 млн ₽</w:t>
+            </w:r>
+          </w:p>
+        </w:tc>
+      </w:tr>
+      <w:tr>
+        <w:trPr>
+          <w:cantSplit/>
+        </w:trPr>
+        <w:tc>
+          <w:tcPr>
+            <w:tcW w:type="dxa" w:w="1701"/>
+            <w:tcMar>
+              <w:top w:w="80" w:type="dxa"/>
+              <w:start w:w="100" w:type="dxa"/>
+              <w:bottom w:w="80" w:type="dxa"/>
+              <w:end w:w="100" w:type="dxa"/>
+            </w:tcMar>
+            <w:shd w:fill="EAF2F8"/>
+          </w:tcPr>
+          <w:p>
+            <w:r>
+              <w:t>Г4</w:t>
+            </w:r>
+          </w:p>
+        </w:tc>
+        <w:tc>
+          <w:tcPr>
+            <w:tcW w:type="dxa" w:w="1871"/>
+            <w:tcMar>
+              <w:top w:w="80" w:type="dxa"/>
+              <w:start w:w="100" w:type="dxa"/>
+              <w:bottom w:w="80" w:type="dxa"/>
+              <w:end w:w="100" w:type="dxa"/>
+            </w:tcMar>
+            <w:shd w:fill="EAF2F8"/>
+          </w:tcPr>
+          <w:p>
+            <w:r>
+              <w:t>0,75 / 101,64 ₽</w:t>
+            </w:r>
+          </w:p>
+        </w:tc>
+        <w:tc>
+          <w:tcPr>
+            <w:tcW w:type="dxa" w:w="2324"/>
+            <w:tcMar>
+              <w:top w:w="80" w:type="dxa"/>
+              <w:start w:w="100" w:type="dxa"/>
+              <w:bottom w:w="80" w:type="dxa"/>
+              <w:end w:w="100" w:type="dxa"/>
+            </w:tcMar>
+            <w:shd w:fill="EAF2F8"/>
+          </w:tcPr>
+          <w:p>
+            <w:r>
+              <w:t>45 826 ед.</w:t>
+            </w:r>
+          </w:p>
+        </w:tc>
+        <w:tc>
+          <w:tcPr>
+            <w:tcW w:type="dxa" w:w="3685"/>
+            <w:tcMar>
+              <w:top w:w="80" w:type="dxa"/>
+              <w:start w:w="100" w:type="dxa"/>
+              <w:bottom w:w="80" w:type="dxa"/>
+              <w:end w:w="100" w:type="dxa"/>
+            </w:tcMar>
+            <w:shd w:fill="EAF2F8"/>
+          </w:tcPr>
+          <w:p>
+            <w:r>
+              <w:t>5,27 → 29,02 млн ₽</w:t>
+            </w:r>
+          </w:p>
+        </w:tc>
+      </w:tr>
+      <w:tr>
+        <w:trPr>
+          <w:cantSplit/>
+        </w:trPr>
+        <w:tc>
+          <w:tcPr>
+            <w:tcW w:type="dxa" w:w="1701"/>
+            <w:tcMar>
+              <w:top w:w="80" w:type="dxa"/>
+              <w:start w:w="100" w:type="dxa"/>
+              <w:bottom w:w="80" w:type="dxa"/>
+              <w:end w:w="100" w:type="dxa"/>
+            </w:tcMar>
+          </w:tcPr>
+          <w:p>
+            <w:r>
+              <w:t>Г5</w:t>
+            </w:r>
+          </w:p>
+        </w:tc>
+        <w:tc>
+          <w:tcPr>
+            <w:tcW w:type="dxa" w:w="1871"/>
+            <w:tcMar>
+              <w:top w:w="80" w:type="dxa"/>
+              <w:start w:w="100" w:type="dxa"/>
+              <w:bottom w:w="80" w:type="dxa"/>
+              <w:end w:w="100" w:type="dxa"/>
+            </w:tcMar>
+          </w:tcPr>
+          <w:p>
+            <w:r>
+              <w:t>0,75 / 104,86 ₽</w:t>
+            </w:r>
+          </w:p>
+        </w:tc>
+        <w:tc>
+          <w:tcPr>
+            <w:tcW w:type="dxa" w:w="2324"/>
+            <w:tcMar>
+              <w:top w:w="80" w:type="dxa"/>
+              <w:start w:w="100" w:type="dxa"/>
+              <w:bottom w:w="80" w:type="dxa"/>
+              <w:end w:w="100" w:type="dxa"/>
+            </w:tcMar>
+          </w:tcPr>
+          <w:p>
+            <w:r>
+              <w:t>44 414 ед.</w:t>
+            </w:r>
+          </w:p>
+        </w:tc>
+        <w:tc>
+          <w:tcPr>
+            <w:tcW w:type="dxa" w:w="3685"/>
+            <w:tcMar>
+              <w:top w:w="80" w:type="dxa"/>
+              <w:start w:w="100" w:type="dxa"/>
+              <w:bottom w:w="80" w:type="dxa"/>
+              <w:end w:w="100" w:type="dxa"/>
+            </w:tcMar>
+          </w:tcPr>
+          <w:p>
+            <w:r>
+              <w:t>5,10 → 34,13 млн ₽</w:t>
+            </w:r>
+          </w:p>
+        </w:tc>
+      </w:tr>
+    </w:tbl>
+    <w:p>
+      <w:pPr/>
+      <w:r>
+        <w:rPr>
+          <w:b/>
+          <w:color w:val="2F5597"/>
+        </w:rPr>
+        <w:t xml:space="preserve">• </w:t>
+      </w:r>
+      <w:r>
+        <w:t>Базовый сценарий: пять пакетов дают около 296 958 единиц. При итоговой цене около 114,92 ₽ за единицу их полная стоимость — около 34,1 млн ₽, то есть практически медиана модели 33,9 млн ₽.</w:t>
+      </w:r>
+    </w:p>
+    <w:p>
+      <w:pPr/>
+      <w:r>
+        <w:rPr>
+          <w:b/>
+          <w:color w:val="2F5597"/>
+        </w:rPr>
+        <w:t xml:space="preserve">• </w:t>
+      </w:r>
+      <w:r>
+        <w:t>Осторожный сценарий: те же зафиксированные 296 958 единиц при итоговой цене около 45,41 ₽ стоят около 13,5 млн ₽. Медиана всей осторожной модели ниже — 10,7 млн ₽, потому что в ней меньше людей получают новый пакет повторно в последующие годы.</w:t>
+      </w:r>
+    </w:p>
+    <w:p>
+      <w:pPr/>
+      <w:r>
+        <w:rPr>
+          <w:i/>
+          <w:color w:val="7F7F7F"/>
+        </w:rPr>
+        <w:t>Колонка «Стоимость → накоплено» показывает полную стоимость каждого пакета и накопленный итог в базовом сценарии после полного закрепления. Она не показывает закрепившуюся на конкретную дату часть и не означает фактическую выплату.</w:t>
+      </w:r>
+    </w:p>
+    <w:p>
+      <w:pPr>
+        <w:pStyle w:val="Heading1"/>
+        <w:pageBreakBefore/>
       </w:pPr>
       <w:r>
         <w:rPr>
@@ -2519,6 +3038,17 @@
     </w:p>
     <w:p>
       <w:pPr>
+        <w:pStyle w:val="Heading1"/>
+      </w:pPr>
+      <w:r>
+        <w:rPr>
+          <w:i w:val="0"/>
+        </w:rPr>
+        <w:t>Основные риски расчётной стоимости</w:t>
+      </w:r>
+    </w:p>
+    <w:p>
+      <w:pPr>
         <w:ind w:left="255" w:hanging="142"/>
         <w:widowControl/>
       </w:pPr>
@@ -2530,18 +3060,7 @@
         <w:t xml:space="preserve">• </w:t>
       </w:r>
       <w:r>
-        <w:t>Критичный найм в середине года возможен только по отдельному решению СД из его резерва 1 млн единиц.</w:t>
-      </w:r>
-    </w:p>
-    <w:p>
-      <w:pPr>
-        <w:pStyle w:val="Heading1"/>
-      </w:pPr>
-      <w:r>
-        <w:rPr>
-          <w:i w:val="0"/>
-        </w:rPr>
-        <w:t>Основные риски расчётной стоимости</w:t>
+        <w:t>Стоимость компании. Оценки 16 млрд ₽ и 8 млрд ₽ — сценарии, а не гарантии. Например, 100 000 единиц при итоговой цене модели стоят около 11,5 млн ₽ в базовом сценарии и около 4,5 млн ₽ в осторожном; фактическая стоимость может быть ниже.</w:t>
       </w:r>
     </w:p>
     <w:p>
@@ -2557,7 +3076,7 @@
         <w:t xml:space="preserve">• </w:t>
       </w:r>
       <w:r>
-        <w:t>16 млрд ₽ и 8 млрд ₽ — сценарные, а не гарантированные оценки. Фактическая стоимость компании и пакетов может быть ниже.</w:t>
+        <w:t>Событие выплаты. Даже полностью закрепившийся пакет сам по себе не даёт денег: без продажи компании, дивидендов или другого утверждённого события фактическая выплата равна 0 ₽.</w:t>
       </w:r>
     </w:p>
     <w:p>
@@ -2573,55 +3092,7 @@
         <w:t xml:space="preserve">• </w:t>
       </w:r>
       <w:r>
-        <w:t>Инвестиционные раунды увеличивают число единиц и уменьшают долю каждой ранее существовавшей единицы.</w:t>
-      </w:r>
-    </w:p>
-    <w:p>
-      <w:pPr>
-        <w:ind w:left="255" w:hanging="142"/>
-        <w:widowControl/>
-      </w:pPr>
-      <w:r>
-        <w:rPr>
-          <w:b/>
-          <w:color w:val="2F5597"/>
-        </w:rPr>
-        <w:t xml:space="preserve">• </w:t>
-      </w:r>
-      <w:r>
-        <w:t>Продажа компании, дивиденды или другое событие выплаты не гарантированы и не привязаны к пятому году программы.</w:t>
-      </w:r>
-    </w:p>
-    <w:p>
-      <w:pPr>
-        <w:ind w:left="255" w:hanging="142"/>
-        <w:widowControl/>
-      </w:pPr>
-      <w:r>
-        <w:rPr>
-          <w:b/>
-          <w:color w:val="2F5597"/>
-        </w:rPr>
-        <w:t xml:space="preserve">• </w:t>
-      </w:r>
-      <w:r>
-        <w:t>Долг, расходы сделки, налоги и особые права инвесторов могут уменьшить сумму, приходящуюся на обыкновенные акции.</w:t>
-      </w:r>
-    </w:p>
-    <w:p>
-      <w:pPr>
-        <w:ind w:left="255" w:hanging="142"/>
-        <w:widowControl/>
-      </w:pPr>
-      <w:r>
-        <w:rPr>
-          <w:b/>
-          <w:color w:val="2F5597"/>
-        </w:rPr>
-        <w:t xml:space="preserve">• </w:t>
-      </w:r>
-      <w:r>
-        <w:t>Расчётная полная стоимость не равна закрепившейся части и не равна сумме к выплате после налогов.</w:t>
+        <w:t>Итоговый расчёт. Долг, расходы сделки, приоритет выплат инвесторам, обязательные удержания и личные налоги могут уменьшить сумму, которую участник получит на руки.</w:t>
       </w:r>
     </w:p>
     <w:p>

</xml_diff>

<commit_message>
Update LTI story and calculator
</commit_message>
<xml_diff>
--- a/lti/downloads/Aivel_LTI_programme_description.docx
+++ b/lti/downloads/Aivel_LTI_programme_description.docx
@@ -74,7 +74,7 @@
                 <w:color w:val="FFFFFF"/>
                 <w:sz w:val="17"/>
               </w:rPr>
-              <w:t>ОСТОРОЖНЫЙ СЦЕНАРИЙ</w:t>
+              <w:t>ОСТОРОЖНЫЙ СЦЕНАРИЙ · 8 МЛРД ₽</w:t>
             </w:r>
           </w:p>
           <w:p>
@@ -88,7 +88,7 @@
                 <w:color w:val="FFFFFF"/>
                 <w:sz w:val="48"/>
               </w:rPr>
-              <w:t>≈ 400 млн ₽</w:t>
+              <w:t>≈ 409 млн ₽</w:t>
             </w:r>
           </w:p>
           <w:p>
@@ -101,7 +101,7 @@
                 <w:color w:val="FFFFFF"/>
                 <w:sz w:val="20"/>
               </w:rPr>
-              <w:t>если компания стоит 8 млрд ₽</w:t>
+              <w:t>9% исходных акций → 5,1% после раундов</w:t>
             </w:r>
           </w:p>
         </w:tc>
@@ -128,7 +128,7 @@
                 <w:color w:val="FFFFFF"/>
                 <w:sz w:val="17"/>
               </w:rPr>
-              <w:t>БАЗОВЫЙ СЦЕНАРИЙ</w:t>
+              <w:t>БАЗОВЫЙ СЦЕНАРИЙ · 16 МЛРД ₽</w:t>
             </w:r>
           </w:p>
           <w:p>
@@ -142,7 +142,7 @@
                 <w:color w:val="FFFFFF"/>
                 <w:sz w:val="48"/>
               </w:rPr>
-              <w:t>≈ 1 млрд ₽</w:t>
+              <w:t>≈ 1,03 млрд ₽</w:t>
             </w:r>
           </w:p>
           <w:p>
@@ -155,7 +155,7 @@
                 <w:color w:val="FFFFFF"/>
                 <w:sz w:val="20"/>
               </w:rPr>
-              <w:t>если компания стоит 16 млрд ₽</w:t>
+              <w:t>9% исходных акций → 6,5% после раундов</w:t>
             </w:r>
           </w:p>
         </w:tc>
@@ -210,7 +210,7 @@
                 <w:color w:val="5E6874"/>
                 <w:sz w:val="21"/>
               </w:rPr>
-              <w:t>Программа действует сверх обычной денежной премии. Итог зависит от ежегодного отбора, результатов, закрепления права и стоимости компании.</w:t>
+              <w:t>Программа действует сверх обычной денежной премии. Ещё 1% исходных акций остаётся резервом СД для будущих критичных наймов.</w:t>
             </w:r>
           </w:p>
         </w:tc>
@@ -286,6 +286,23 @@
       </w:r>
     </w:p>
     <w:p>
+      <w:pPr>
+        <w:pStyle w:val="Heading2"/>
+        <w:keepNext/>
+      </w:pPr>
+      <w:r>
+        <w:t>Особые ситуации</w:t>
+      </w:r>
+    </w:p>
+    <w:p>
+      <w:pPr>
+        <w:spacing w:after="140" w:line="269" w:lineRule="auto"/>
+      </w:pPr>
+      <w:r>
+        <w:t>При добросовестном или нейтральном уходе закреплённое сохраняется, незакреплённое прекращается по правилам плана. Для недобросовестного ухода, смерти или инвалидности и продажи компании применяются специальные положения утверждённого плана.</w:t>
+      </w:r>
+    </w:p>
+    <w:p>
       <w:r>
         <w:br w:type="page"/>
       </w:r>
@@ -339,7 +356,7 @@
         <w:spacing w:after="140" w:line="269" w:lineRule="auto"/>
       </w:pPr>
       <w:r>
-        <w:t>Участник должен существенно влиять на выручку, давать измеримое улучшение за счёт искусственного интеллекта или контролировать существенные финансовые, юридические либо операционные риски.</w:t>
+        <w:t>Участник должен существенно влиять на выручку через сделки, интеграцию или органический рост; повышать маржу бизнеса с помощью ИИ и других улучшений; либо контролировать существенные финансовые, юридические или операционные риски.</w:t>
       </w:r>
     </w:p>
     <w:p>
@@ -348,6 +365,14 @@
       </w:pPr>
       <w:r>
         <w:t>Допустимые размеры годового пакета: 0,25 / 0,5 / 0,75 / 1,0 годовой стоимости сотрудника с учётом всех налогов и взносов.</w:t>
+      </w:r>
+    </w:p>
+    <w:p>
+      <w:pPr>
+        <w:spacing w:after="140" w:line="269" w:lineRule="auto"/>
+      </w:pPr>
+      <w:r>
+        <w:t>Условная единица — экономическое право по плану, а не акция и не право голоса. Для расчёта 100 млн условных единиц соответствуют всем исходным акциям; при индикативной оценке 1,6 млрд ₽ одна единица стоит 16 ₽.</w:t>
       </w:r>
     </w:p>
     <w:tbl>
@@ -1034,7 +1059,7 @@
         <w:spacing w:after="140" w:line="269" w:lineRule="auto"/>
       </w:pPr>
       <w:r>
-        <w:t>При зарплате 450 тыс. ₽, первом пакете 0,5, результате первого года 88%, последующем пути пакетов 0,75 / 0,75 / 0,75 / 1,0 и выполнении показателей следующих лет на 100% полная расчётная стоимость в базовом сценарии составляет около 44 млн ₽ после полного закрепления.</w:t>
+        <w:t>При зарплате 450 тыс. ₽, первом пакете 0,5, результате первого года 88%, последующем пути пакетов 0,75 / 0,75 / 0,75 / 1,0 и выполнении показателей следующих лет на 100% полная расчётная стоимость составляет около 47,5 млн ₽ в базовом сценарии и 27,1 млн ₽ в осторожном.</w:t>
       </w:r>
     </w:p>
     <w:p>
@@ -1042,7 +1067,7 @@
         <w:spacing w:after="140" w:line="269" w:lineRule="auto"/>
       </w:pPr>
       <w:r>
-        <w:t>К концу пятого года ранние пакеты закреплены сильнее поздних; оставшаяся часть продолжает закрепляться, пока участник работает в компании.</w:t>
+        <w:t>К концу пятого года в этом примере закрепилось около 35,1 млн ₽ в базовом сценарии и 16,6 млн ₽ в осторожном. Оставшаяся часть продолжает закрепляться, пока участник работает в компании.</w:t>
       </w:r>
     </w:p>
     <w:p>
@@ -1220,7 +1245,7 @@
         <w:t xml:space="preserve">Зависит от команды. </w:t>
       </w:r>
       <w:r>
-        <w:t>рост стоимости компании определяет ёмкость программы, число новых пакетов и их стоимость.</w:t>
+        <w:t>оценка задаёт денежную ёмкость годового предела, а состав ролей и размеры пакетов определяют число получателей.</w:t>
       </w:r>
     </w:p>
     <w:p>
@@ -1274,7 +1299,7 @@
                 <w:color w:val="0F1722"/>
                 <w:sz w:val="26"/>
               </w:rPr>
-              <w:t>Два ориентира медианного полного результата</w:t>
+              <w:t>Два ориентира медианного участника</w:t>
             </w:r>
           </w:p>
           <w:p>
@@ -1287,29 +1312,625 @@
                 <w:color w:val="5E6874"/>
                 <w:sz w:val="21"/>
               </w:rPr>
-              <w:t>Базовый сценарий 16 млрд ₽: около 33,9 млн ₽. Осторожный сценарий 8 млрд ₽: около 10,7 млн ₽. Это расчётная стоимость после полного закрепления, а не обещанная выплата на дату.</w:t>
+              <w:t>Базовый сценарий 16 млрд ₽: около 34,6 млн ₽. Осторожный сценарий 8 млрд ₽: около 10,3 млн ₽. Это расчётная стоимость по цене Г6 при условии полного закрепления, выполнения показателей на 100% и отсутствия уходов.</w:t>
             </w:r>
           </w:p>
         </w:tc>
       </w:tr>
     </w:tbl>
-    <w:p>
-      <w:pPr>
-        <w:pStyle w:val="Heading2"/>
-        <w:keepNext/>
-      </w:pPr>
-      <w:r>
-        <w:t>Особые ситуации</w:t>
-      </w:r>
-    </w:p>
-    <w:p>
-      <w:pPr>
-        <w:spacing w:after="140" w:line="269" w:lineRule="auto"/>
-      </w:pPr>
-      <w:r>
-        <w:t>При добросовестном или нейтральном уходе закреплённое сохраняется, незакреплённое прекращается по правилам плана. Для недобросовестного ухода, смерти или инвалидности и продажи компании применяются специальные положения утверждённого плана.</w:t>
-      </w:r>
-    </w:p>
+    <w:tbl>
+      <w:tblPr>
+        <w:tblStyle w:val="TableGrid"/>
+        <w:tblW w:type="auto" w:w="0"/>
+        <w:tblLook w:firstColumn="1" w:firstRow="1" w:lastColumn="0" w:lastRow="0" w:noHBand="0" w:noVBand="1" w:val="04A0"/>
+      </w:tblPr>
+      <w:tblGrid>
+        <w:gridCol w:w="1457"/>
+        <w:gridCol w:w="1457"/>
+        <w:gridCol w:w="1457"/>
+        <w:gridCol w:w="1457"/>
+        <w:gridCol w:w="1457"/>
+        <w:gridCol w:w="1457"/>
+        <w:gridCol w:w="1457"/>
+      </w:tblGrid>
+      <w:tr>
+        <w:trPr>
+          <w:tblHeader w:val="true"/>
+        </w:trPr>
+        <w:tc>
+          <w:tcPr>
+            <w:tcW w:type="dxa" w:w="1457"/>
+            <w:shd w:fill="0F1722"/>
+            <w:vAlign w:val="center"/>
+            <w:tcMar>
+              <w:top w:w="120" w:type="dxa"/>
+              <w:left w:w="140" w:type="dxa"/>
+              <w:bottom w:w="120" w:type="dxa"/>
+              <w:right w:w="140" w:type="dxa"/>
+            </w:tcMar>
+          </w:tcPr>
+          <w:p>
+            <w:pPr>
+              <w:spacing w:after="0"/>
+            </w:pPr>
+            <w:r/>
+            <w:r>
+              <w:rPr>
+                <w:rFonts w:ascii="Arial" w:hAnsi="Arial"/>
+                <w:b/>
+                <w:color w:val="FFFFFF"/>
+                <w:sz w:val="17"/>
+              </w:rPr>
+              <w:t>Сценарий</w:t>
+            </w:r>
+          </w:p>
+        </w:tc>
+        <w:tc>
+          <w:tcPr>
+            <w:tcW w:type="dxa" w:w="1457"/>
+            <w:shd w:fill="0F1722"/>
+            <w:vAlign w:val="center"/>
+            <w:tcMar>
+              <w:top w:w="120" w:type="dxa"/>
+              <w:left w:w="140" w:type="dxa"/>
+              <w:bottom w:w="120" w:type="dxa"/>
+              <w:right w:w="140" w:type="dxa"/>
+            </w:tcMar>
+          </w:tcPr>
+          <w:p>
+            <w:pPr>
+              <w:spacing w:after="0"/>
+            </w:pPr>
+            <w:r/>
+            <w:r>
+              <w:rPr>
+                <w:rFonts w:ascii="Arial" w:hAnsi="Arial"/>
+                <w:b/>
+                <w:color w:val="FFFFFF"/>
+                <w:sz w:val="17"/>
+              </w:rPr>
+              <w:t>Г1</w:t>
+            </w:r>
+          </w:p>
+        </w:tc>
+        <w:tc>
+          <w:tcPr>
+            <w:tcW w:type="dxa" w:w="1457"/>
+            <w:shd w:fill="0F1722"/>
+            <w:vAlign w:val="center"/>
+            <w:tcMar>
+              <w:top w:w="120" w:type="dxa"/>
+              <w:left w:w="140" w:type="dxa"/>
+              <w:bottom w:w="120" w:type="dxa"/>
+              <w:right w:w="140" w:type="dxa"/>
+            </w:tcMar>
+          </w:tcPr>
+          <w:p>
+            <w:pPr>
+              <w:spacing w:after="0"/>
+            </w:pPr>
+            <w:r/>
+            <w:r>
+              <w:rPr>
+                <w:rFonts w:ascii="Arial" w:hAnsi="Arial"/>
+                <w:b/>
+                <w:color w:val="FFFFFF"/>
+                <w:sz w:val="17"/>
+              </w:rPr>
+              <w:t>Г2</w:t>
+            </w:r>
+          </w:p>
+        </w:tc>
+        <w:tc>
+          <w:tcPr>
+            <w:tcW w:type="dxa" w:w="1457"/>
+            <w:shd w:fill="0F1722"/>
+            <w:vAlign w:val="center"/>
+            <w:tcMar>
+              <w:top w:w="120" w:type="dxa"/>
+              <w:left w:w="140" w:type="dxa"/>
+              <w:bottom w:w="120" w:type="dxa"/>
+              <w:right w:w="140" w:type="dxa"/>
+            </w:tcMar>
+          </w:tcPr>
+          <w:p>
+            <w:pPr>
+              <w:spacing w:after="0"/>
+            </w:pPr>
+            <w:r/>
+            <w:r>
+              <w:rPr>
+                <w:rFonts w:ascii="Arial" w:hAnsi="Arial"/>
+                <w:b/>
+                <w:color w:val="FFFFFF"/>
+                <w:sz w:val="17"/>
+              </w:rPr>
+              <w:t>Г3</w:t>
+            </w:r>
+          </w:p>
+        </w:tc>
+        <w:tc>
+          <w:tcPr>
+            <w:tcW w:type="dxa" w:w="1457"/>
+            <w:shd w:fill="0F1722"/>
+            <w:vAlign w:val="center"/>
+            <w:tcMar>
+              <w:top w:w="120" w:type="dxa"/>
+              <w:left w:w="140" w:type="dxa"/>
+              <w:bottom w:w="120" w:type="dxa"/>
+              <w:right w:w="140" w:type="dxa"/>
+            </w:tcMar>
+          </w:tcPr>
+          <w:p>
+            <w:pPr>
+              <w:spacing w:after="0"/>
+            </w:pPr>
+            <w:r/>
+            <w:r>
+              <w:rPr>
+                <w:rFonts w:ascii="Arial" w:hAnsi="Arial"/>
+                <w:b/>
+                <w:color w:val="FFFFFF"/>
+                <w:sz w:val="17"/>
+              </w:rPr>
+              <w:t>Г4</w:t>
+            </w:r>
+          </w:p>
+        </w:tc>
+        <w:tc>
+          <w:tcPr>
+            <w:tcW w:type="dxa" w:w="1457"/>
+            <w:shd w:fill="0F1722"/>
+            <w:vAlign w:val="center"/>
+            <w:tcMar>
+              <w:top w:w="120" w:type="dxa"/>
+              <w:left w:w="140" w:type="dxa"/>
+              <w:bottom w:w="120" w:type="dxa"/>
+              <w:right w:w="140" w:type="dxa"/>
+            </w:tcMar>
+          </w:tcPr>
+          <w:p>
+            <w:pPr>
+              <w:spacing w:after="0"/>
+            </w:pPr>
+            <w:r/>
+            <w:r>
+              <w:rPr>
+                <w:rFonts w:ascii="Arial" w:hAnsi="Arial"/>
+                <w:b/>
+                <w:color w:val="FFFFFF"/>
+                <w:sz w:val="17"/>
+              </w:rPr>
+              <w:t>Г5</w:t>
+            </w:r>
+          </w:p>
+        </w:tc>
+        <w:tc>
+          <w:tcPr>
+            <w:tcW w:type="dxa" w:w="1457"/>
+            <w:shd w:fill="0F1722"/>
+            <w:vAlign w:val="center"/>
+            <w:tcMar>
+              <w:top w:w="120" w:type="dxa"/>
+              <w:left w:w="140" w:type="dxa"/>
+              <w:bottom w:w="120" w:type="dxa"/>
+              <w:right w:w="140" w:type="dxa"/>
+            </w:tcMar>
+          </w:tcPr>
+          <w:p>
+            <w:pPr>
+              <w:spacing w:after="0"/>
+            </w:pPr>
+            <w:r/>
+            <w:r>
+              <w:rPr>
+                <w:rFonts w:ascii="Arial" w:hAnsi="Arial"/>
+                <w:b/>
+                <w:color w:val="FFFFFF"/>
+                <w:sz w:val="17"/>
+              </w:rPr>
+              <w:t>Медиана Г6</w:t>
+            </w:r>
+          </w:p>
+        </w:tc>
+      </w:tr>
+      <w:tr>
+        <w:tc>
+          <w:tcPr>
+            <w:tcW w:type="dxa" w:w="1457"/>
+            <w:shd w:fill="EEF3FA"/>
+            <w:vAlign w:val="center"/>
+            <w:tcMar>
+              <w:top w:w="120" w:type="dxa"/>
+              <w:left w:w="140" w:type="dxa"/>
+              <w:bottom w:w="120" w:type="dxa"/>
+              <w:right w:w="140" w:type="dxa"/>
+            </w:tcMar>
+          </w:tcPr>
+          <w:p>
+            <w:pPr>
+              <w:spacing w:after="0"/>
+            </w:pPr>
+            <w:r/>
+            <w:r>
+              <w:rPr>
+                <w:rFonts w:ascii="Arial" w:hAnsi="Arial"/>
+                <w:b/>
+                <w:color w:val="0F1722"/>
+                <w:sz w:val="17"/>
+              </w:rPr>
+              <w:t>Базовый</w:t>
+            </w:r>
+          </w:p>
+        </w:tc>
+        <w:tc>
+          <w:tcPr>
+            <w:tcW w:type="dxa" w:w="1457"/>
+            <w:shd w:fill="EEF3FA"/>
+            <w:vAlign w:val="center"/>
+            <w:tcMar>
+              <w:top w:w="120" w:type="dxa"/>
+              <w:left w:w="140" w:type="dxa"/>
+              <w:bottom w:w="120" w:type="dxa"/>
+              <w:right w:w="140" w:type="dxa"/>
+            </w:tcMar>
+          </w:tcPr>
+          <w:p>
+            <w:pPr>
+              <w:spacing w:after="0"/>
+            </w:pPr>
+            <w:r/>
+            <w:r>
+              <w:rPr>
+                <w:rFonts w:ascii="Arial" w:hAnsi="Arial"/>
+                <w:b w:val="0"/>
+                <w:color w:val="0F1722"/>
+                <w:sz w:val="17"/>
+              </w:rPr>
+              <w:t>20</w:t>
+            </w:r>
+          </w:p>
+        </w:tc>
+        <w:tc>
+          <w:tcPr>
+            <w:tcW w:type="dxa" w:w="1457"/>
+            <w:shd w:fill="EEF3FA"/>
+            <w:vAlign w:val="center"/>
+            <w:tcMar>
+              <w:top w:w="120" w:type="dxa"/>
+              <w:left w:w="140" w:type="dxa"/>
+              <w:bottom w:w="120" w:type="dxa"/>
+              <w:right w:w="140" w:type="dxa"/>
+            </w:tcMar>
+          </w:tcPr>
+          <w:p>
+            <w:pPr>
+              <w:spacing w:after="0"/>
+            </w:pPr>
+            <w:r/>
+            <w:r>
+              <w:rPr>
+                <w:rFonts w:ascii="Arial" w:hAnsi="Arial"/>
+                <w:b w:val="0"/>
+                <w:color w:val="0F1722"/>
+                <w:sz w:val="17"/>
+              </w:rPr>
+              <w:t>20</w:t>
+            </w:r>
+          </w:p>
+        </w:tc>
+        <w:tc>
+          <w:tcPr>
+            <w:tcW w:type="dxa" w:w="1457"/>
+            <w:shd w:fill="EEF3FA"/>
+            <w:vAlign w:val="center"/>
+            <w:tcMar>
+              <w:top w:w="120" w:type="dxa"/>
+              <w:left w:w="140" w:type="dxa"/>
+              <w:bottom w:w="120" w:type="dxa"/>
+              <w:right w:w="140" w:type="dxa"/>
+            </w:tcMar>
+          </w:tcPr>
+          <w:p>
+            <w:pPr>
+              <w:spacing w:after="0"/>
+            </w:pPr>
+            <w:r/>
+            <w:r>
+              <w:rPr>
+                <w:rFonts w:ascii="Arial" w:hAnsi="Arial"/>
+                <w:b w:val="0"/>
+                <w:color w:val="0F1722"/>
+                <w:sz w:val="17"/>
+              </w:rPr>
+              <w:t>20</w:t>
+            </w:r>
+          </w:p>
+        </w:tc>
+        <w:tc>
+          <w:tcPr>
+            <w:tcW w:type="dxa" w:w="1457"/>
+            <w:shd w:fill="EEF3FA"/>
+            <w:vAlign w:val="center"/>
+            <w:tcMar>
+              <w:top w:w="120" w:type="dxa"/>
+              <w:left w:w="140" w:type="dxa"/>
+              <w:bottom w:w="120" w:type="dxa"/>
+              <w:right w:w="140" w:type="dxa"/>
+            </w:tcMar>
+          </w:tcPr>
+          <w:p>
+            <w:pPr>
+              <w:spacing w:after="0"/>
+            </w:pPr>
+            <w:r/>
+            <w:r>
+              <w:rPr>
+                <w:rFonts w:ascii="Arial" w:hAnsi="Arial"/>
+                <w:b w:val="0"/>
+                <w:color w:val="0F1722"/>
+                <w:sz w:val="17"/>
+              </w:rPr>
+              <w:t>20</w:t>
+            </w:r>
+          </w:p>
+        </w:tc>
+        <w:tc>
+          <w:tcPr>
+            <w:tcW w:type="dxa" w:w="1457"/>
+            <w:shd w:fill="EEF3FA"/>
+            <w:vAlign w:val="center"/>
+            <w:tcMar>
+              <w:top w:w="120" w:type="dxa"/>
+              <w:left w:w="140" w:type="dxa"/>
+              <w:bottom w:w="120" w:type="dxa"/>
+              <w:right w:w="140" w:type="dxa"/>
+            </w:tcMar>
+          </w:tcPr>
+          <w:p>
+            <w:pPr>
+              <w:spacing w:after="0"/>
+            </w:pPr>
+            <w:r/>
+            <w:r>
+              <w:rPr>
+                <w:rFonts w:ascii="Arial" w:hAnsi="Arial"/>
+                <w:b w:val="0"/>
+                <w:color w:val="0F1722"/>
+                <w:sz w:val="17"/>
+              </w:rPr>
+              <w:t>13</w:t>
+            </w:r>
+          </w:p>
+        </w:tc>
+        <w:tc>
+          <w:tcPr>
+            <w:tcW w:type="dxa" w:w="1457"/>
+            <w:shd w:fill="EEF3FA"/>
+            <w:vAlign w:val="center"/>
+            <w:tcMar>
+              <w:top w:w="120" w:type="dxa"/>
+              <w:left w:w="140" w:type="dxa"/>
+              <w:bottom w:w="120" w:type="dxa"/>
+              <w:right w:w="140" w:type="dxa"/>
+            </w:tcMar>
+          </w:tcPr>
+          <w:p>
+            <w:pPr>
+              <w:spacing w:after="0"/>
+            </w:pPr>
+            <w:r/>
+            <w:r>
+              <w:rPr>
+                <w:rFonts w:ascii="Arial" w:hAnsi="Arial"/>
+                <w:b w:val="0"/>
+                <w:color w:val="0F1722"/>
+                <w:sz w:val="17"/>
+              </w:rPr>
+              <w:t>34,6 млн ₽</w:t>
+            </w:r>
+          </w:p>
+        </w:tc>
+      </w:tr>
+      <w:tr>
+        <w:tc>
+          <w:tcPr>
+            <w:tcW w:type="dxa" w:w="1457"/>
+            <w:shd w:fill="FFFFFF"/>
+            <w:vAlign w:val="center"/>
+            <w:tcMar>
+              <w:top w:w="120" w:type="dxa"/>
+              <w:left w:w="140" w:type="dxa"/>
+              <w:bottom w:w="120" w:type="dxa"/>
+              <w:right w:w="140" w:type="dxa"/>
+            </w:tcMar>
+          </w:tcPr>
+          <w:p>
+            <w:pPr>
+              <w:spacing w:after="0"/>
+            </w:pPr>
+            <w:r/>
+            <w:r>
+              <w:rPr>
+                <w:rFonts w:ascii="Arial" w:hAnsi="Arial"/>
+                <w:b/>
+                <w:color w:val="0F1722"/>
+                <w:sz w:val="17"/>
+              </w:rPr>
+              <w:t>Осторожный</w:t>
+            </w:r>
+          </w:p>
+        </w:tc>
+        <w:tc>
+          <w:tcPr>
+            <w:tcW w:type="dxa" w:w="1457"/>
+            <w:shd w:fill="FFFFFF"/>
+            <w:vAlign w:val="center"/>
+            <w:tcMar>
+              <w:top w:w="120" w:type="dxa"/>
+              <w:left w:w="140" w:type="dxa"/>
+              <w:bottom w:w="120" w:type="dxa"/>
+              <w:right w:w="140" w:type="dxa"/>
+            </w:tcMar>
+          </w:tcPr>
+          <w:p>
+            <w:pPr>
+              <w:spacing w:after="0"/>
+            </w:pPr>
+            <w:r/>
+            <w:r>
+              <w:rPr>
+                <w:rFonts w:ascii="Arial" w:hAnsi="Arial"/>
+                <w:b w:val="0"/>
+                <w:color w:val="0F1722"/>
+                <w:sz w:val="17"/>
+              </w:rPr>
+              <w:t>20</w:t>
+            </w:r>
+          </w:p>
+        </w:tc>
+        <w:tc>
+          <w:tcPr>
+            <w:tcW w:type="dxa" w:w="1457"/>
+            <w:shd w:fill="FFFFFF"/>
+            <w:vAlign w:val="center"/>
+            <w:tcMar>
+              <w:top w:w="120" w:type="dxa"/>
+              <w:left w:w="140" w:type="dxa"/>
+              <w:bottom w:w="120" w:type="dxa"/>
+              <w:right w:w="140" w:type="dxa"/>
+            </w:tcMar>
+          </w:tcPr>
+          <w:p>
+            <w:pPr>
+              <w:spacing w:after="0"/>
+            </w:pPr>
+            <w:r/>
+            <w:r>
+              <w:rPr>
+                <w:rFonts w:ascii="Arial" w:hAnsi="Arial"/>
+                <w:b w:val="0"/>
+                <w:color w:val="0F1722"/>
+                <w:sz w:val="17"/>
+              </w:rPr>
+              <w:t>20</w:t>
+            </w:r>
+          </w:p>
+        </w:tc>
+        <w:tc>
+          <w:tcPr>
+            <w:tcW w:type="dxa" w:w="1457"/>
+            <w:shd w:fill="FFFFFF"/>
+            <w:vAlign w:val="center"/>
+            <w:tcMar>
+              <w:top w:w="120" w:type="dxa"/>
+              <w:left w:w="140" w:type="dxa"/>
+              <w:bottom w:w="120" w:type="dxa"/>
+              <w:right w:w="140" w:type="dxa"/>
+            </w:tcMar>
+          </w:tcPr>
+          <w:p>
+            <w:pPr>
+              <w:spacing w:after="0"/>
+            </w:pPr>
+            <w:r/>
+            <w:r>
+              <w:rPr>
+                <w:rFonts w:ascii="Arial" w:hAnsi="Arial"/>
+                <w:b w:val="0"/>
+                <w:color w:val="0F1722"/>
+                <w:sz w:val="17"/>
+              </w:rPr>
+              <w:t>20</w:t>
+            </w:r>
+          </w:p>
+        </w:tc>
+        <w:tc>
+          <w:tcPr>
+            <w:tcW w:type="dxa" w:w="1457"/>
+            <w:shd w:fill="FFFFFF"/>
+            <w:vAlign w:val="center"/>
+            <w:tcMar>
+              <w:top w:w="120" w:type="dxa"/>
+              <w:left w:w="140" w:type="dxa"/>
+              <w:bottom w:w="120" w:type="dxa"/>
+              <w:right w:w="140" w:type="dxa"/>
+            </w:tcMar>
+          </w:tcPr>
+          <w:p>
+            <w:pPr>
+              <w:spacing w:after="0"/>
+            </w:pPr>
+            <w:r/>
+            <w:r>
+              <w:rPr>
+                <w:rFonts w:ascii="Arial" w:hAnsi="Arial"/>
+                <w:b w:val="0"/>
+                <w:color w:val="0F1722"/>
+                <w:sz w:val="17"/>
+              </w:rPr>
+              <w:t>13</w:t>
+            </w:r>
+          </w:p>
+        </w:tc>
+        <w:tc>
+          <w:tcPr>
+            <w:tcW w:type="dxa" w:w="1457"/>
+            <w:shd w:fill="FFFFFF"/>
+            <w:vAlign w:val="center"/>
+            <w:tcMar>
+              <w:top w:w="120" w:type="dxa"/>
+              <w:left w:w="140" w:type="dxa"/>
+              <w:bottom w:w="120" w:type="dxa"/>
+              <w:right w:w="140" w:type="dxa"/>
+            </w:tcMar>
+          </w:tcPr>
+          <w:p>
+            <w:pPr>
+              <w:spacing w:after="0"/>
+            </w:pPr>
+            <w:r/>
+            <w:r>
+              <w:rPr>
+                <w:rFonts w:ascii="Arial" w:hAnsi="Arial"/>
+                <w:b w:val="0"/>
+                <w:color w:val="0F1722"/>
+                <w:sz w:val="17"/>
+              </w:rPr>
+              <w:t>4</w:t>
+            </w:r>
+          </w:p>
+        </w:tc>
+        <w:tc>
+          <w:tcPr>
+            <w:tcW w:type="dxa" w:w="1457"/>
+            <w:shd w:fill="FFFFFF"/>
+            <w:vAlign w:val="center"/>
+            <w:tcMar>
+              <w:top w:w="120" w:type="dxa"/>
+              <w:left w:w="140" w:type="dxa"/>
+              <w:bottom w:w="120" w:type="dxa"/>
+              <w:right w:w="140" w:type="dxa"/>
+            </w:tcMar>
+          </w:tcPr>
+          <w:p>
+            <w:pPr>
+              <w:spacing w:after="0"/>
+            </w:pPr>
+            <w:r/>
+            <w:r>
+              <w:rPr>
+                <w:rFonts w:ascii="Arial" w:hAnsi="Arial"/>
+                <w:b w:val="0"/>
+                <w:color w:val="0F1722"/>
+                <w:sz w:val="17"/>
+              </w:rPr>
+              <w:t>10,3 млн ₽</w:t>
+            </w:r>
+          </w:p>
+        </w:tc>
+      </w:tr>
+    </w:tbl>
     <w:p>
       <w:r>
         <w:br w:type="page"/>
@@ -1335,7 +1956,7 @@
         <w:keepNext/>
       </w:pPr>
       <w:r>
-        <w:t>Согласованные 10% работают на рост и удержание</w:t>
+        <w:t>Привлечь сильных. Удержать ключевых. Выровнять интересы команды и инвесторов</w:t>
       </w:r>
     </w:p>
     <w:p>
@@ -1347,7 +1968,7 @@
           <w:color w:val="5E6874"/>
           <w:sz w:val="28"/>
         </w:rPr>
-        <w:t>Программа превращает долю капитала в пять лет ежегодных результатов и трёхлетнее удержание ключевых людей.</w:t>
+        <w:t>Программа связывает вознаграждение с ежегодным результатом, ростом стоимости компании и продолжением работы в ней.</w:t>
       </w:r>
     </w:p>
     <w:p>
@@ -1374,10 +1995,10 @@
         <w:rPr>
           <w:b/>
         </w:rPr>
-        <w:t xml:space="preserve">Направить. </w:t>
+        <w:t xml:space="preserve">Удержать. </w:t>
       </w:r>
       <w:r>
-        <w:t>каждый новый пакет на измеримый результат предстоящего года.</w:t>
+        <w:t>уже заработанный пакет закрепляется только за 36 месяцев работы в компании.</w:t>
       </w:r>
     </w:p>
     <w:p>
@@ -1389,10 +2010,10 @@
         <w:rPr>
           <w:b/>
         </w:rPr>
-        <w:t xml:space="preserve">Удержать. </w:t>
+        <w:t xml:space="preserve">Общий экономический результат. </w:t>
       </w:r>
       <w:r>
-        <w:t>уже заработанный пакет закрепляется только за 36 месяцев работы в компании.</w:t>
+        <w:t>вознаграждение растёт только вместе со стоимостью компании.</w:t>
       </w:r>
     </w:p>
     <w:p>
@@ -1401,7 +2022,7 @@
         <w:keepNext/>
       </w:pPr>
       <w:r>
-        <w:t>Архитектура уже согласованных 10%</w:t>
+        <w:t>Как распределяются 10%</w:t>
       </w:r>
     </w:p>
     <w:tbl>
@@ -1672,7 +2293,7 @@
                 <w:color w:val="FFFFFF"/>
                 <w:sz w:val="30"/>
               </w:rPr>
-              <w:t>1%</w:t>
+              <w:t>1,5%</w:t>
             </w:r>
           </w:p>
         </w:tc>
@@ -1728,7 +2349,7 @@
                 <w:color w:val="FFFFFF"/>
                 <w:sz w:val="30"/>
               </w:rPr>
-              <w:t>1%</w:t>
+              <w:t>0,5%</w:t>
             </w:r>
           </w:p>
         </w:tc>

</xml_diff>

<commit_message>
Publish team-selected LTI programme
</commit_message>
<xml_diff>
--- a/lti/downloads/Aivel_LTI_programme_description.docx
+++ b/lti/downloads/Aivel_LTI_programme_description.docx
@@ -101,7 +101,7 @@
                 <w:color w:val="FFFFFF"/>
                 <w:sz w:val="20"/>
               </w:rPr>
-              <w:t>9% исходных акций → 5,1% после раундов</w:t>
+              <w:t>Предел 9% исходных акций → 5,1% после раундов</w:t>
             </w:r>
           </w:p>
         </w:tc>
@@ -155,7 +155,7 @@
                 <w:color w:val="FFFFFF"/>
                 <w:sz w:val="20"/>
               </w:rPr>
-              <w:t>9% исходных акций → 6,5% после раундов</w:t>
+              <w:t>Предел 9% исходных акций → 6,5% после раундов</w:t>
             </w:r>
           </w:p>
         </w:tc>
@@ -234,10 +234,10 @@
         <w:rPr>
           <w:b/>
         </w:rPr>
-        <w:t xml:space="preserve">1 · Попасть. </w:t>
+        <w:t xml:space="preserve">1 · Быть выбранным. </w:t>
       </w:r>
       <w:r>
-        <w:t>СД выбирает участника и до начала года утверждает целевой пакет.</w:t>
+        <w:t>Заслужить ограниченные голоса команды; формула определит целевой пакет.</w:t>
       </w:r>
     </w:p>
     <w:p>
@@ -282,7 +282,7 @@
         <w:t xml:space="preserve">4 · Повторить. </w:t>
       </w:r>
       <w:r>
-        <w:t>Для нового пакета следующего года нужно снова пройти отбор; автоматического продления нет.</w:t>
+        <w:t>Для нового пакета нужно снова заслужить голоса; новый выбор не отменяет уже заработанное.</w:t>
       </w:r>
     </w:p>
     <w:p>
@@ -299,7 +299,7 @@
         <w:spacing w:after="140" w:line="269" w:lineRule="auto"/>
       </w:pPr>
       <w:r>
-        <w:t>При добросовестном или нейтральном уходе закреплённое сохраняется, незакреплённое прекращается по правилам плана. Для недобросовестного ухода, смерти или инвалидности и продажи компании применяются специальные положения утверждённого плана.</w:t>
+        <w:t>При добросовестном или нейтральном уходе закреплённое сохраняется, незакреплённое прекращается по правилам плана. Для недобросовестного ухода, смерти или инвалидности и продажи компании применяются специальные положения утверждённого плана. Юридически действуют утверждённый план и индивидуальное уведомление.</w:t>
       </w:r>
     </w:p>
     <w:p>
@@ -348,7 +348,7 @@
         <w:keepNext/>
       </w:pPr>
       <w:r>
-        <w:t>1. Отбор и целевой пакет</w:t>
+        <w:t>1. Командный выбор и целевой пакет</w:t>
       </w:r>
     </w:p>
     <w:p>
@@ -364,7 +364,15 @@
         <w:spacing w:after="140" w:line="269" w:lineRule="auto"/>
       </w:pPr>
       <w:r>
-        <w:t>Допустимые размеры годового пакета: 0,25 / 0,5 / 0,75 / 1,0 годовой стоимости сотрудника с учётом всех налогов и взносов.</w:t>
+        <w:t>Годовой лимит делится поровну между пятью направлениями: ключевые роли — СЕО и CPO/CTO; M&amp;A, включая CFO и CLO; коммерция; маркетинг; продуктовая команда. Каждое направление голосует за сравнительную полезность людей ограниченными голосами. СЕО и CPO/CTO голосуют во всех пяти направлениях наравне с участниками, без права вето; за себя голосовать нельзя. По ключевым ролям голосует общий круг представителей пяти направлений.</w:t>
+      </w:r>
+    </w:p>
+    <w:p>
+      <w:pPr>
+        <w:spacing w:after="140" w:line="269" w:lineRule="auto"/>
+      </w:pPr>
+      <w:r>
+        <w:t>Концентрация поддержки определяет число участников и пакет 0,25 / 0,5 / 0,75 / 1. Пакет 1 — одна годовая зарплата с учётом всех налогов и взносов компании; остальные пакеты — соответствующие части этой суммы. Чтобы получить пакет 1, нужно стать выраженным центром командного согласия.</w:t>
       </w:r>
     </w:p>
     <w:p>
@@ -530,7 +538,7 @@
                 <w:color w:val="0F1722"/>
                 <w:sz w:val="21"/>
               </w:rPr>
-              <w:t>Полная годовая стоимость</w:t>
+              <w:t>Годовая зарплата с налогами и взносами</w:t>
             </w:r>
           </w:p>
         </w:tc>
@@ -738,7 +746,7 @@
                 <w:color w:val="FFFFFF"/>
                 <w:sz w:val="21"/>
               </w:rPr>
-              <w:t>194 тыс. целевых единиц × 88% = примерно 171 тыс. заработанных единиц. СД утвердил пакет и показатели до начала года; после этого формула работает автоматически.</w:t>
+              <w:t>194 тыс. целевых единиц × 88% = примерно 171 тыс. заработанных единиц. Участник и пакет определены до начала года; после этого формула работает автоматически.</w:t>
             </w:r>
           </w:p>
         </w:tc>
@@ -999,19 +1007,6 @@
     </w:tbl>
     <w:p>
       <w:pPr>
-        <w:spacing w:after="140" w:line="269" w:lineRule="auto"/>
-      </w:pPr>
-      <w:r>
-        <w:t>Каждый ежегодный пакет живёт отдельно. Новый пакет может начаться, пока предыдущие продолжают закрепляться по своим трёхлетним графикам.</w:t>
-      </w:r>
-    </w:p>
-    <w:p>
-      <w:r>
-        <w:br w:type="page"/>
-      </w:r>
-    </w:p>
-    <w:p>
-      <w:pPr>
         <w:spacing w:before="160" w:after="100"/>
       </w:pPr>
       <w:r>
@@ -1030,7 +1025,7 @@
         <w:keepNext/>
       </w:pPr>
       <w:r>
-        <w:t>Большой результат складывается из пяти отдельных ежегодных решений</w:t>
+        <w:t>Большой результат складывается из пяти отдельных ежегодных выборов</w:t>
       </w:r>
     </w:p>
     <w:p>
@@ -1230,7 +1225,7 @@
         <w:t xml:space="preserve">Зависит от участника. </w:t>
       </w:r>
       <w:r>
-        <w:t>ежегодный отбор, личный результат, вклад в общую цель и работа в компании в течение срока закрепления.</w:t>
+        <w:t>полезность для команды, личный результат и работа в компании в течение срока закрепления.</w:t>
       </w:r>
     </w:p>
     <w:p>
@@ -1245,7 +1240,7 @@
         <w:t xml:space="preserve">Зависит от команды. </w:t>
       </w:r>
       <w:r>
-        <w:t>оценка задаёт денежную ёмкость годового предела, а состав ролей и размеры пакетов определяют число получателей.</w:t>
+        <w:t>ограниченные голоса определяют участие и размер пакета; результат компании и оценка влияют на заработанную часть и итоговую сумму.</w:t>
       </w:r>
     </w:p>
     <w:p>
@@ -1312,7 +1307,7 @@
                 <w:color w:val="5E6874"/>
                 <w:sz w:val="21"/>
               </w:rPr>
-              <w:t>Базовый сценарий 16 млрд ₽: около 34,6 млн ₽. Осторожный сценарий 8 млрд ₽: около 10,3 млн ₽. Это расчётная стоимость по цене Г6 при условии полного закрепления, выполнения показателей на 100% и отсутствия уходов.</w:t>
+              <w:t>Базовый сценарий 16 млрд ₽: около 23,8 млн ₽. Осторожный сценарий 8 млрд ₽: около 10,5 млн ₽. Это расчётная стоимость по цене Г6 при условии полного закрепления, выполнения показателей на 100% и отсутствия уходов.</w:t>
             </w:r>
           </w:p>
         </w:tc>
@@ -1587,7 +1582,7 @@
                 <w:color w:val="0F1722"/>
                 <w:sz w:val="17"/>
               </w:rPr>
-              <w:t>20</w:t>
+              <w:t>19</w:t>
             </w:r>
           </w:p>
         </w:tc>
@@ -1643,7 +1638,7 @@
                 <w:color w:val="0F1722"/>
                 <w:sz w:val="17"/>
               </w:rPr>
-              <w:t>20</w:t>
+              <w:t>17</w:t>
             </w:r>
           </w:p>
         </w:tc>
@@ -1671,7 +1666,7 @@
                 <w:color w:val="0F1722"/>
                 <w:sz w:val="17"/>
               </w:rPr>
-              <w:t>20</w:t>
+              <w:t>16</w:t>
             </w:r>
           </w:p>
         </w:tc>
@@ -1699,7 +1694,7 @@
                 <w:color w:val="0F1722"/>
                 <w:sz w:val="17"/>
               </w:rPr>
-              <w:t>13</w:t>
+              <w:t>11</w:t>
             </w:r>
           </w:p>
         </w:tc>
@@ -1727,7 +1722,7 @@
                 <w:color w:val="0F1722"/>
                 <w:sz w:val="17"/>
               </w:rPr>
-              <w:t>34,6 млн ₽</w:t>
+              <w:t>23,8 млн ₽</w:t>
             </w:r>
           </w:p>
         </w:tc>
@@ -1785,35 +1780,7 @@
                 <w:color w:val="0F1722"/>
                 <w:sz w:val="17"/>
               </w:rPr>
-              <w:t>20</w:t>
-            </w:r>
-          </w:p>
-        </w:tc>
-        <w:tc>
-          <w:tcPr>
-            <w:tcW w:type="dxa" w:w="1457"/>
-            <w:shd w:fill="FFFFFF"/>
-            <w:vAlign w:val="center"/>
-            <w:tcMar>
-              <w:top w:w="120" w:type="dxa"/>
-              <w:left w:w="140" w:type="dxa"/>
-              <w:bottom w:w="120" w:type="dxa"/>
-              <w:right w:w="140" w:type="dxa"/>
-            </w:tcMar>
-          </w:tcPr>
-          <w:p>
-            <w:pPr>
-              <w:spacing w:after="0"/>
-            </w:pPr>
-            <w:r/>
-            <w:r>
-              <w:rPr>
-                <w:rFonts w:ascii="Arial" w:hAnsi="Arial"/>
-                <w:b w:val="0"/>
-                <w:color w:val="0F1722"/>
-                <w:sz w:val="17"/>
-              </w:rPr>
-              <w:t>20</w:t>
+              <w:t>19</w:t>
             </w:r>
           </w:p>
         </w:tc>
@@ -1897,7 +1864,7 @@
                 <w:color w:val="0F1722"/>
                 <w:sz w:val="17"/>
               </w:rPr>
-              <w:t>4</w:t>
+              <w:t>10</w:t>
             </w:r>
           </w:p>
         </w:tc>
@@ -1925,7 +1892,35 @@
                 <w:color w:val="0F1722"/>
                 <w:sz w:val="17"/>
               </w:rPr>
-              <w:t>10,3 млн ₽</w:t>
+              <w:t>7</w:t>
+            </w:r>
+          </w:p>
+        </w:tc>
+        <w:tc>
+          <w:tcPr>
+            <w:tcW w:type="dxa" w:w="1457"/>
+            <w:shd w:fill="FFFFFF"/>
+            <w:vAlign w:val="center"/>
+            <w:tcMar>
+              <w:top w:w="120" w:type="dxa"/>
+              <w:left w:w="140" w:type="dxa"/>
+              <w:bottom w:w="120" w:type="dxa"/>
+              <w:right w:w="140" w:type="dxa"/>
+            </w:tcMar>
+          </w:tcPr>
+          <w:p>
+            <w:pPr>
+              <w:spacing w:after="0"/>
+            </w:pPr>
+            <w:r/>
+            <w:r>
+              <w:rPr>
+                <w:rFonts w:ascii="Arial" w:hAnsi="Arial"/>
+                <w:b w:val="0"/>
+                <w:color w:val="0F1722"/>
+                <w:sz w:val="17"/>
+              </w:rPr>
+              <w:t>10,5 млн ₽</w:t>
             </w:r>
           </w:p>
         </w:tc>
@@ -2388,7 +2383,7 @@
         <w:spacing w:after="140" w:line="269" w:lineRule="auto"/>
       </w:pPr>
       <w:r>
-        <w:t>На старте программы 100 млн акций; 10% равны 10 млн условных единиц. Плановые выдачи используют 9 млн единиц, 1 млн остаётся резервом СД для будущих критичных наймов.</w:t>
+        <w:t>На старте программы 100 млн акций; 10% равны 10 млн условных единиц. До 9 млн единиц доступны для плановых выдач, 1 млн остаётся отдельным резервом СД для будущих критичных наймов. Из-за шага пакета 0,25 и потолка в одну годовую зарплату фактическая выдача может быть ниже предела.</w:t>
       </w:r>
     </w:p>
     <w:p>
@@ -2405,7 +2400,7 @@
         <w:keepNext/>
       </w:pPr>
       <w:r>
-        <w:t>Два барьера каждого пакета</w:t>
+        <w:t>Выбор, результат и удержание</w:t>
       </w:r>
     </w:p>
     <w:tbl>
@@ -2446,7 +2441,7 @@
                 <w:color w:val="FFFFFF"/>
                 <w:sz w:val="22"/>
               </w:rPr>
-              <w:t>1 · Результат</w:t>
+              <w:t>1 · Выбрать и заработать</w:t>
             </w:r>
           </w:p>
         </w:tc>
@@ -2504,7 +2499,7 @@
                 <w:color w:val="0F1722"/>
                 <w:sz w:val="20"/>
               </w:rPr>
-              <w:t>СД утверждает участника и пакет до начала года. После года применяется формула 60% компания + 40% личный результат. Новый пакет следующего года не гарантирован.</w:t>
+              <w:t>Пять направлений получают равные лимиты капитала. Команды выбирают людей ограниченными голосами, концентрация поддержки определяет пакет 0,25–1 годовой зарплаты с налогами и взносами компании, а после года применяется формула 60% компания + 40% личный результат.</w:t>
             </w:r>
           </w:p>
         </w:tc>
@@ -2554,7 +2549,7 @@
           <w:color w:val="0A66D6"/>
           <w:sz w:val="17"/>
         </w:rPr>
-        <w:t>ДЛЯ ИНВЕСТОРОВ · ОХВАТ</w:t>
+        <w:t>ДЛЯ ИНВЕСТОРОВ · РАСПРЕДЕЛЕНИЕ</w:t>
       </w:r>
     </w:p>
     <w:p>
@@ -2563,7 +2558,19 @@
         <w:keepNext/>
       </w:pPr>
       <w:r>
-        <w:t>До 20 участников покрывают разные источники стоимости</w:t>
+        <w:t>Пять направлений самостоятельно распределяют равные части годового лимита</w:t>
+      </w:r>
+    </w:p>
+    <w:p>
+      <w:pPr>
+        <w:spacing w:after="280"/>
+      </w:pPr>
+      <w:r>
+        <w:rPr>
+          <w:color w:val="5E6874"/>
+          <w:sz w:val="28"/>
+        </w:rPr>
+        <w:t>Равными являются лимиты капитала, а не число мест.</w:t>
       </w:r>
     </w:p>
     <w:tbl>
@@ -2633,7 +2640,7 @@
                 <w:color w:val="FFFFFF"/>
                 <w:sz w:val="21"/>
               </w:rPr>
-              <w:t>Что создаёт или сохраняет стоимость</w:t>
+              <w:t>Зона ответственности</w:t>
             </w:r>
           </w:p>
         </w:tc>
@@ -2663,7 +2670,7 @@
                 <w:color w:val="0F1722"/>
                 <w:sz w:val="21"/>
               </w:rPr>
-              <w:t>Сделки и интеграция</w:t>
+              <w:t>Ключевые роли</w:t>
             </w:r>
           </w:p>
         </w:tc>
@@ -2691,7 +2698,7 @@
                 <w:color w:val="0F1722"/>
                 <w:sz w:val="21"/>
               </w:rPr>
-              <w:t>приобретённая выручка, синергии и скорость объединения</w:t>
+              <w:t>СЕО и CPO/CTO: сквозная ответственность за результат компании</w:t>
             </w:r>
           </w:p>
         </w:tc>
@@ -2721,7 +2728,7 @@
                 <w:color w:val="0F1722"/>
                 <w:sz w:val="21"/>
               </w:rPr>
-              <w:t>Разработка</w:t>
+              <w:t>M&amp;A</w:t>
             </w:r>
           </w:p>
         </w:tc>
@@ -2749,7 +2756,7 @@
                 <w:color w:val="0F1722"/>
                 <w:sz w:val="21"/>
               </w:rPr>
-              <w:t>рост продукта и производительности</w:t>
+              <w:t>сделки и интеграция, включая CFO и CLO</w:t>
             </w:r>
           </w:p>
         </w:tc>
@@ -2779,7 +2786,7 @@
                 <w:color w:val="0F1722"/>
                 <w:sz w:val="21"/>
               </w:rPr>
-              <w:t>Операционный центр</w:t>
+              <w:t>Коммерция</w:t>
             </w:r>
           </w:p>
         </w:tc>
@@ -2807,7 +2814,7 @@
                 <w:color w:val="0F1722"/>
                 <w:sz w:val="21"/>
               </w:rPr>
-              <w:t>маржа, качество и масштабируемость</w:t>
+              <w:t>новая выручка, удержание и развитие клиентской базы</w:t>
             </w:r>
           </w:p>
         </w:tc>
@@ -2837,7 +2844,7 @@
                 <w:color w:val="0F1722"/>
                 <w:sz w:val="21"/>
               </w:rPr>
-              <w:t>Коммерческий рост</w:t>
+              <w:t>Маркетинг</w:t>
             </w:r>
           </w:p>
         </w:tc>
@@ -2865,7 +2872,7 @@
                 <w:color w:val="0F1722"/>
                 <w:sz w:val="21"/>
               </w:rPr>
-              <w:t>новая выручка и новые клиенты</w:t>
+              <w:t>спрос, позиционирование и вклад в коммерческий рост</w:t>
             </w:r>
           </w:p>
         </w:tc>
@@ -2895,7 +2902,7 @@
                 <w:color w:val="0F1722"/>
                 <w:sz w:val="21"/>
               </w:rPr>
-              <w:t>Удержание и развитие базы</w:t>
+              <w:t>Продуктовая команда</w:t>
             </w:r>
           </w:p>
         </w:tc>
@@ -2923,65 +2930,7 @@
                 <w:color w:val="0F1722"/>
                 <w:sz w:val="21"/>
               </w:rPr>
-              <w:t>сохранённая и расширенная повторяющаяся выручка</w:t>
-            </w:r>
-          </w:p>
-        </w:tc>
-      </w:tr>
-      <w:tr>
-        <w:tc>
-          <w:tcPr>
-            <w:tcW w:type="dxa" w:w="5100"/>
-            <w:shd w:fill="FFFFFF"/>
-            <w:vAlign w:val="center"/>
-            <w:tcMar>
-              <w:top w:w="120" w:type="dxa"/>
-              <w:left w:w="140" w:type="dxa"/>
-              <w:bottom w:w="120" w:type="dxa"/>
-              <w:right w:w="140" w:type="dxa"/>
-            </w:tcMar>
-          </w:tcPr>
-          <w:p>
-            <w:pPr>
-              <w:spacing w:after="0"/>
-            </w:pPr>
-            <w:r/>
-            <w:r>
-              <w:rPr>
-                <w:rFonts w:ascii="Arial" w:hAnsi="Arial"/>
-                <w:b/>
-                <w:color w:val="0F1722"/>
-                <w:sz w:val="21"/>
-              </w:rPr>
-              <w:t>Контроль рисков</w:t>
-            </w:r>
-          </w:p>
-        </w:tc>
-        <w:tc>
-          <w:tcPr>
-            <w:tcW w:type="dxa" w:w="5100"/>
-            <w:shd w:fill="FFFFFF"/>
-            <w:vAlign w:val="center"/>
-            <w:tcMar>
-              <w:top w:w="120" w:type="dxa"/>
-              <w:left w:w="140" w:type="dxa"/>
-              <w:bottom w:w="120" w:type="dxa"/>
-              <w:right w:w="140" w:type="dxa"/>
-            </w:tcMar>
-          </w:tcPr>
-          <w:p>
-            <w:pPr>
-              <w:spacing w:after="0"/>
-            </w:pPr>
-            <w:r/>
-            <w:r>
-              <w:rPr>
-                <w:rFonts w:ascii="Arial" w:hAnsi="Arial"/>
-                <w:b w:val="0"/>
-                <w:color w:val="0F1722"/>
-                <w:sz w:val="21"/>
-              </w:rPr>
-              <w:t>предотвращённые финансовые и юридические потери</w:t>
+              <w:t>продукт, технологии, ИИ и рост маржи бизнеса</w:t>
             </w:r>
           </w:p>
         </w:tc>
@@ -3023,7 +2972,7 @@
                 <w:color w:val="0F1722"/>
                 <w:sz w:val="26"/>
               </w:rPr>
-              <w:t>Широкий охват не увеличивает согласованные 10%</w:t>
+              <w:t>Ширина программы регулируется самими командами</w:t>
             </w:r>
           </w:p>
           <w:p>
@@ -3036,7 +2985,7 @@
                 <w:color w:val="5E6874"/>
                 <w:sz w:val="21"/>
               </w:rPr>
-              <w:t>СД ежегодно выбирает конкретных участников и размеры новых пакетов внутри неизменной архитектуры: 9% плановых выдач и 1% резерва.</w:t>
+              <w:t>Концентрированные голоса дают меньше крупных пакетов, распределённые — больше небольших. В одном направлении может быть один крупный пакет, в другом — несколько меньших. Общий предел неизменен: до 9% плановых выдач и 1% отдельного резерва СД. По ключевым ролям голосует общий круг представителей пяти направлений.</w:t>
             </w:r>
           </w:p>
         </w:tc>
@@ -3350,10 +3299,10 @@
         <w:rPr>
           <w:b/>
         </w:rPr>
-        <w:t xml:space="preserve">До года. </w:t>
+        <w:t xml:space="preserve">Единые правила. </w:t>
       </w:r>
       <w:r>
-        <w:t>СД утверждает участника, пакет, цену единицы и показатели.</w:t>
+        <w:t>СД утверждает механику, показатели и общий предел программы.</w:t>
       </w:r>
     </w:p>
     <w:p>
@@ -3365,10 +3314,10 @@
         <w:rPr>
           <w:b/>
         </w:rPr>
-        <w:t xml:space="preserve">После года. </w:t>
+        <w:t xml:space="preserve">Каждый год. </w:t>
       </w:r>
       <w:r>
-        <w:t>заранее заданная формула определяет заработанную часть без пересмотра по новой оценке.</w:t>
+        <w:t>команды заново распределяют ограниченные голоса, а формула определяет участников и пакеты; автоматического права на следующий пакет нет.</w:t>
       </w:r>
     </w:p>
     <w:p>
@@ -3380,33 +3329,10 @@
         <w:rPr>
           <w:b/>
         </w:rPr>
-        <w:t xml:space="preserve">После результата. </w:t>
+        <w:t xml:space="preserve">После выбора. </w:t>
       </w:r>
       <w:r>
-        <w:t>трёхлетний срок закрепления удерживает участника.</w:t>
-      </w:r>
-    </w:p>
-    <w:p>
-      <w:pPr>
-        <w:pStyle w:val="ListBullet"/>
-        <w:spacing w:after="80"/>
-      </w:pPr>
-      <w:r>
-        <w:rPr>
-          <w:b/>
-        </w:rPr>
-        <w:t xml:space="preserve">Каждый новый год. </w:t>
-      </w:r>
-      <w:r>
-        <w:t>СД заново отбирает критичных участников в пределах годового объёма и общего ограничения.</w:t>
-      </w:r>
-    </w:p>
-    <w:p>
-      <w:pPr>
-        <w:spacing w:after="140" w:line="269" w:lineRule="auto"/>
-      </w:pPr>
-      <w:r>
-        <w:t>Юридически действуют утверждённый план и индивидуальное уведомление. Настоящее описание объясняет экономическую механику и не создаёт отдельного обещания выплаты.</w:t>
+        <w:t>формула 60 / 40 определяет заработанную часть, а трёхлетний срок закрепления удерживает участника.</w:t>
       </w:r>
     </w:p>
     <w:sectPr>

</xml_diff>